<commit_message>
docs: perbarui laporan UTS sesuai revisi aplikasi
</commit_message>
<xml_diff>
--- a/Laporan_UTS_Pemrograman_Multiplatform_Noval_Dwi_Pamungkas_240605110040.docx
+++ b/Laporan_UTS_Pemrograman_Multiplatform_Noval_Dwi_Pamungkas_240605110040.docx
@@ -4,44 +4,548 @@
   <w:body>
     <w:p>
       <w:pPr>
-        <w:spacing w:line="276" w:lineRule="auto" w:after="360"/>
+        <w:spacing w:after="120"/>
         <w:jc w:val="center"/>
       </w:pPr>
       <w:r>
         <w:rPr>
+          <w:rFonts w:ascii="Times New Roman" w:hAnsi="Times New Roman"/>
           <w:b/>
           <w:sz w:val="28"/>
         </w:rPr>
-        <w:t>LAPORAN PRAKTIKUM UJIAN TENGAH SEMESTER (UTS)</w:t>
-        <w:br/>
+        <w:t>LAPORAN UJIAN TENGAH SEMESTER (UTS)</w:t>
       </w:r>
+    </w:p>
+    <w:p>
+      <w:pPr>
+        <w:spacing w:after="120"/>
+        <w:jc w:val="center"/>
+      </w:pPr>
       <w:r>
         <w:rPr>
+          <w:rFonts w:ascii="Times New Roman" w:hAnsi="Times New Roman"/>
           <w:b/>
           <w:sz w:val="26"/>
         </w:rPr>
         <w:t>MATA KULIAH PEMROGRAMAN MULTIPLATFORM</w:t>
-        <w:br/>
-        <w:br/>
-      </w:r>
-      <w:r>
-        <w:rPr>
-          <w:b/>
-          <w:color w:val="2563EB"/>
-          <w:sz w:val="26"/>
-        </w:rPr>
-        <w:t>“PENGEMBANGAN APLIKASI FINTRACK - CATATAN KEUANGAN PRIBADI BERBASIS FLUTTER DENGAN PENERAPAN ASYNCHRONOUS PROGRAMMING, SQLITE, DAN SHARED PREFERENCES”</w:t>
       </w:r>
     </w:p>
     <w:p>
       <w:pPr>
-        <w:spacing w:before="360" w:after="480"/>
+        <w:spacing w:after="120"/>
+        <w:jc w:val="center"/>
+      </w:pPr>
+      <w:r>
+        <w:rPr>
+          <w:rFonts w:ascii="Times New Roman" w:hAnsi="Times New Roman"/>
+          <w:b/>
+          <w:sz w:val="28"/>
+        </w:rPr>
+        <w:t>PENGEMBANGAN APLIKASI FINTRACK</w:t>
+      </w:r>
+    </w:p>
+    <w:p>
+      <w:pPr>
+        <w:spacing w:after="120"/>
+        <w:jc w:val="center"/>
+      </w:pPr>
+      <w:r>
+        <w:rPr>
+          <w:rFonts w:ascii="Times New Roman" w:hAnsi="Times New Roman"/>
+          <w:b/>
+          <w:sz w:val="24"/>
+        </w:rPr>
+        <w:t>CATATAN KEUANGAN PRIBADI BERBASIS FLUTTER</w:t>
+      </w:r>
+    </w:p>
+    <w:p>
+      <w:pPr>
+        <w:spacing w:after="120"/>
+        <w:jc w:val="center"/>
+      </w:pPr>
+      <w:r>
+        <w:rPr>
+          <w:rFonts w:ascii="Times New Roman" w:hAnsi="Times New Roman"/>
+          <w:b/>
+          <w:sz w:val="22"/>
+        </w:rPr>
+        <w:t>DENGAN ASYNCHRONOUS PROGRAMMING, SQLITE, DAN SHARED PREFERENCES</w:t>
+      </w:r>
+    </w:p>
+    <w:p>
+      <w:pPr>
+        <w:spacing w:after="120"/>
+        <w:jc w:val="center"/>
+      </w:pPr>
+      <w:r>
+        <w:rPr>
+          <w:rFonts w:ascii="Times New Roman" w:hAnsi="Times New Roman"/>
+          <w:b w:val="0"/>
+          <w:sz w:val="24"/>
+        </w:rPr>
+      </w:r>
+    </w:p>
+    <w:p>
+      <w:pPr>
+        <w:spacing w:after="120"/>
+        <w:jc w:val="center"/>
+      </w:pPr>
+      <w:r>
+        <w:rPr>
+          <w:rFonts w:ascii="Times New Roman" w:hAnsi="Times New Roman"/>
+          <w:b w:val="0"/>
+          <w:sz w:val="24"/>
+        </w:rPr>
+      </w:r>
+    </w:p>
+    <w:p>
+      <w:pPr>
+        <w:spacing w:after="120"/>
+        <w:jc w:val="center"/>
+      </w:pPr>
+      <w:r>
+        <w:rPr>
+          <w:rFonts w:ascii="Times New Roman" w:hAnsi="Times New Roman"/>
+          <w:b w:val="0"/>
+          <w:sz w:val="24"/>
+        </w:rPr>
+      </w:r>
+    </w:p>
+    <w:p>
+      <w:pPr>
+        <w:spacing w:after="120"/>
+        <w:jc w:val="center"/>
+      </w:pPr>
+      <w:r>
+        <w:rPr>
+          <w:rFonts w:ascii="Times New Roman" w:hAnsi="Times New Roman"/>
+          <w:b/>
+          <w:sz w:val="24"/>
+        </w:rPr>
+        <w:t>Disusun Oleh:</w:t>
+      </w:r>
+    </w:p>
+    <w:p>
+      <w:pPr>
+        <w:spacing w:after="120"/>
+        <w:jc w:val="center"/>
+      </w:pPr>
+      <w:r>
+        <w:rPr>
+          <w:rFonts w:ascii="Times New Roman" w:hAnsi="Times New Roman"/>
+          <w:b/>
+          <w:sz w:val="24"/>
+        </w:rPr>
+        <w:t>NOVAL DWI PAMUNGKAS</w:t>
+      </w:r>
+    </w:p>
+    <w:p>
+      <w:pPr>
+        <w:spacing w:after="120"/>
+        <w:jc w:val="center"/>
+      </w:pPr>
+      <w:r>
+        <w:rPr>
+          <w:rFonts w:ascii="Times New Roman" w:hAnsi="Times New Roman"/>
+          <w:b/>
+          <w:sz w:val="24"/>
+        </w:rPr>
+        <w:t>NIM: 240605110040</w:t>
+      </w:r>
+    </w:p>
+    <w:p>
+      <w:pPr>
+        <w:spacing w:after="120"/>
+        <w:jc w:val="center"/>
+      </w:pPr>
+      <w:r>
+        <w:rPr>
+          <w:rFonts w:ascii="Times New Roman" w:hAnsi="Times New Roman"/>
+          <w:b w:val="0"/>
+          <w:sz w:val="24"/>
+        </w:rPr>
+        <w:t>Kelas A — Semester 5</w:t>
+      </w:r>
+    </w:p>
+    <w:p>
+      <w:pPr>
+        <w:spacing w:after="120"/>
+        <w:jc w:val="center"/>
+      </w:pPr>
+      <w:r>
+        <w:rPr>
+          <w:rFonts w:ascii="Times New Roman" w:hAnsi="Times New Roman"/>
+          <w:b w:val="0"/>
+          <w:sz w:val="24"/>
+        </w:rPr>
+      </w:r>
+    </w:p>
+    <w:p>
+      <w:pPr>
+        <w:spacing w:after="120"/>
+        <w:jc w:val="center"/>
+      </w:pPr>
+      <w:r>
+        <w:rPr>
+          <w:rFonts w:ascii="Times New Roman" w:hAnsi="Times New Roman"/>
+          <w:b w:val="0"/>
+          <w:sz w:val="24"/>
+        </w:rPr>
+      </w:r>
+    </w:p>
+    <w:p>
+      <w:pPr>
+        <w:spacing w:after="120"/>
+        <w:jc w:val="center"/>
+      </w:pPr>
+      <w:r>
+        <w:rPr>
+          <w:rFonts w:ascii="Times New Roman" w:hAnsi="Times New Roman"/>
+          <w:b w:val="0"/>
+          <w:sz w:val="24"/>
+        </w:rPr>
+      </w:r>
+    </w:p>
+    <w:p>
+      <w:pPr>
+        <w:spacing w:after="120"/>
+        <w:jc w:val="center"/>
+      </w:pPr>
+      <w:r>
+        <w:rPr>
+          <w:rFonts w:ascii="Times New Roman" w:hAnsi="Times New Roman"/>
+          <w:b w:val="0"/>
+          <w:sz w:val="24"/>
+        </w:rPr>
+        <w:t>Dosen Pengampu: A'la Syauqi, M.Kom</w:t>
+      </w:r>
+    </w:p>
+    <w:p>
+      <w:pPr>
+        <w:spacing w:after="120"/>
+        <w:jc w:val="center"/>
+      </w:pPr>
+      <w:r>
+        <w:rPr>
+          <w:rFonts w:ascii="Times New Roman" w:hAnsi="Times New Roman"/>
+          <w:b/>
+          <w:sz w:val="24"/>
+        </w:rPr>
+        <w:t>PROGRAM STUDI S1 TEKNIK INFORMATIKA</w:t>
+      </w:r>
+    </w:p>
+    <w:p>
+      <w:pPr>
+        <w:spacing w:after="120"/>
+        <w:jc w:val="center"/>
+      </w:pPr>
+      <w:r>
+        <w:rPr>
+          <w:rFonts w:ascii="Times New Roman" w:hAnsi="Times New Roman"/>
+          <w:b/>
+          <w:sz w:val="24"/>
+        </w:rPr>
+        <w:t>FAKULTAS SAINS DAN TEKNOLOGI</w:t>
+      </w:r>
+    </w:p>
+    <w:p>
+      <w:pPr>
+        <w:spacing w:after="120"/>
+        <w:jc w:val="center"/>
+      </w:pPr>
+      <w:r>
+        <w:rPr>
+          <w:rFonts w:ascii="Times New Roman" w:hAnsi="Times New Roman"/>
+          <w:b/>
+          <w:sz w:val="24"/>
+        </w:rPr>
+        <w:t>UNIVERSITAS ISLAM NEGERI MAULANA MALIK IBRAHIM MALANG</w:t>
+      </w:r>
+    </w:p>
+    <w:p>
+      <w:pPr>
+        <w:spacing w:after="120"/>
+        <w:jc w:val="center"/>
+      </w:pPr>
+      <w:r>
+        <w:rPr>
+          <w:rFonts w:ascii="Times New Roman" w:hAnsi="Times New Roman"/>
+          <w:b/>
+          <w:sz w:val="24"/>
+        </w:rPr>
+        <w:t>2026</w:t>
+      </w:r>
+    </w:p>
+    <w:p>
+      <w:r>
+        <w:br w:type="page"/>
+      </w:r>
+    </w:p>
+    <w:p>
+      <w:pPr>
+        <w:pStyle w:val="Heading1"/>
+        <w:jc w:val="center"/>
+      </w:pPr>
+      <w:r>
+        <w:rPr>
+          <w:rFonts w:ascii="Times New Roman" w:hAnsi="Times New Roman"/>
+          <w:b w:val="0"/>
+          <w:sz w:val="24"/>
+        </w:rPr>
+        <w:t>BAB I</w:t>
+      </w:r>
+    </w:p>
+    <w:p>
+      <w:pPr>
+        <w:pStyle w:val="Heading1"/>
+        <w:jc w:val="center"/>
+      </w:pPr>
+      <w:r>
+        <w:rPr>
+          <w:rFonts w:ascii="Times New Roman" w:hAnsi="Times New Roman"/>
+          <w:b w:val="0"/>
+          <w:sz w:val="24"/>
+        </w:rPr>
+        <w:t>PENDAHULUAN</w:t>
+      </w:r>
+    </w:p>
+    <w:p>
+      <w:pPr>
+        <w:pStyle w:val="Heading2"/>
+      </w:pPr>
+      <w:r>
+        <w:rPr>
+          <w:rFonts w:ascii="Times New Roman" w:hAnsi="Times New Roman"/>
+          <w:b w:val="0"/>
+          <w:sz w:val="24"/>
+        </w:rPr>
+        <w:t>1.1 Latar Belakang dan Gambaran Aplikasi</w:t>
+      </w:r>
+    </w:p>
+    <w:p>
+      <w:pPr>
+        <w:ind w:firstLine="709"/>
+      </w:pPr>
+      <w:r>
+        <w:rPr>
+          <w:rFonts w:ascii="Times New Roman" w:hAnsi="Times New Roman"/>
+          <w:b w:val="0"/>
+          <w:sz w:val="24"/>
+        </w:rPr>
+        <w:t>FinTrack merupakan aplikasi pencatatan keuangan pribadi yang dibangun menggunakan Flutter dan Dart. Aplikasi ini membantu pengguna mencatat pemasukan serta pengeluaran, melihat saldo bersih, mengatur anggaran, dan mengevaluasi transaksi berdasarkan kategori. Pendekatan offline-first dipilih agar data transaksi tetap dapat digunakan tanpa koneksi internet.</w:t>
+      </w:r>
+    </w:p>
+    <w:p>
+      <w:pPr>
+        <w:ind w:firstLine="709"/>
+      </w:pPr>
+      <w:r>
+        <w:rPr>
+          <w:rFonts w:ascii="Times New Roman" w:hAnsi="Times New Roman"/>
+          <w:b w:val="0"/>
+          <w:sz w:val="24"/>
+        </w:rPr>
+        <w:t>Aplikasi menerapkan asynchronous programming pada operasi database, SharedPreferences, dan simulasi pemuatan tips finansial. Dua teknik data persistence digunakan sesuai karakter data: SQLite untuk data transaksi terstruktur dan SharedPreferences untuk preferensi sederhana seperti tema, nama pengguna, serta anggaran bulanan.</w:t>
+      </w:r>
+    </w:p>
+    <w:p>
+      <w:pPr>
+        <w:pStyle w:val="Heading2"/>
+      </w:pPr>
+      <w:r>
+        <w:rPr>
+          <w:rFonts w:ascii="Times New Roman" w:hAnsi="Times New Roman"/>
+          <w:b w:val="0"/>
+          <w:sz w:val="24"/>
+        </w:rPr>
+        <w:t>1.2 Tujuan</w:t>
+      </w:r>
+    </w:p>
+    <w:p>
+      <w:pPr>
+        <w:pStyle w:val="ListBullet"/>
+        <w:spacing w:line="360" w:lineRule="auto"/>
+        <w:jc w:val="both"/>
+      </w:pPr>
+      <w:r>
+        <w:t>Membangun aplikasi keuangan multiplatform dengan satu basis kode Flutter.</w:t>
+      </w:r>
+    </w:p>
+    <w:p>
+      <w:pPr>
+        <w:pStyle w:val="ListBullet"/>
+        <w:spacing w:line="360" w:lineRule="auto"/>
+        <w:jc w:val="both"/>
+      </w:pPr>
+      <w:r>
+        <w:t>Menerapkan Future, async, await, Future.wait, dan Future.delayed.</w:t>
+      </w:r>
+    </w:p>
+    <w:p>
+      <w:pPr>
+        <w:pStyle w:val="ListBullet"/>
+        <w:spacing w:line="360" w:lineRule="auto"/>
+        <w:jc w:val="both"/>
+      </w:pPr>
+      <w:r>
+        <w:t>Menerapkan CRUD SQLite untuk transaksi dan SharedPreferences untuk preferensi.</w:t>
+      </w:r>
+    </w:p>
+    <w:p>
+      <w:pPr>
+        <w:pStyle w:val="ListBullet"/>
+        <w:spacing w:line="360" w:lineRule="auto"/>
+        <w:jc w:val="both"/>
+      </w:pPr>
+      <w:r>
+        <w:t>Menyediakan antarmuka yang responsif, informatif, dan mudah digunakan.</w:t>
+      </w:r>
+    </w:p>
+    <w:p>
+      <w:pPr>
+        <w:pStyle w:val="Heading2"/>
+      </w:pPr>
+      <w:r>
+        <w:rPr>
+          <w:rFonts w:ascii="Times New Roman" w:hAnsi="Times New Roman"/>
+          <w:b w:val="0"/>
+          <w:sz w:val="24"/>
+        </w:rPr>
+        <w:t>1.3 Fitur Aplikasi</w:t>
+      </w:r>
+    </w:p>
+    <w:p>
+      <w:pPr>
+        <w:pStyle w:val="ListBullet"/>
+        <w:spacing w:line="360" w:lineRule="auto"/>
+        <w:jc w:val="both"/>
+      </w:pPr>
+      <w:r>
+        <w:t>Dashboard saldo bersih, pemasukan, pengeluaran, status surplus/defisit, dan progress anggaran.</w:t>
+      </w:r>
+    </w:p>
+    <w:p>
+      <w:pPr>
+        <w:pStyle w:val="ListBullet"/>
+        <w:spacing w:line="360" w:lineRule="auto"/>
+        <w:jc w:val="both"/>
+      </w:pPr>
+      <w:r>
+        <w:t>Tambah, baca, edit, dan hapus transaksi.</w:t>
+      </w:r>
+    </w:p>
+    <w:p>
+      <w:pPr>
+        <w:pStyle w:val="ListBullet"/>
+        <w:spacing w:line="360" w:lineRule="auto"/>
+        <w:jc w:val="both"/>
+      </w:pPr>
+      <w:r>
+        <w:t>Pencarian transaksi serta filter pemasukan/pengeluaran.</w:t>
+      </w:r>
+    </w:p>
+    <w:p>
+      <w:pPr>
+        <w:pStyle w:val="ListBullet"/>
+        <w:spacing w:line="360" w:lineRule="auto"/>
+        <w:jc w:val="both"/>
+      </w:pPr>
+      <w:r>
+        <w:t>Statistik agregasi berdasarkan kategori.</w:t>
+      </w:r>
+    </w:p>
+    <w:p>
+      <w:pPr>
+        <w:pStyle w:val="ListBullet"/>
+        <w:spacing w:line="360" w:lineRule="auto"/>
+        <w:jc w:val="both"/>
+      </w:pPr>
+      <w:r>
+        <w:t>Dark mode, nama pengguna, dan anggaran bulanan yang tersimpan persisten.</w:t>
+      </w:r>
+    </w:p>
+    <w:p>
+      <w:pPr>
+        <w:pStyle w:val="ListBullet"/>
+        <w:spacing w:line="360" w:lineRule="auto"/>
+        <w:jc w:val="both"/>
+      </w:pPr>
+      <w:r>
+        <w:t>Tips finansial dengan simulasi asynchronous delay.</w:t>
+      </w:r>
+    </w:p>
+    <w:p>
+      <w:pPr>
+        <w:pStyle w:val="ListBullet"/>
+        <w:spacing w:line="360" w:lineRule="auto"/>
+        <w:jc w:val="both"/>
+      </w:pPr>
+      <w:r>
+        <w:t>Reset seluruh data transaksi melalui konfirmasi pengguna.</w:t>
+      </w:r>
+    </w:p>
+    <w:p>
+      <w:pPr>
+        <w:pStyle w:val="Heading1"/>
+        <w:jc w:val="center"/>
+      </w:pPr>
+      <w:r>
+        <w:rPr>
+          <w:rFonts w:ascii="Times New Roman" w:hAnsi="Times New Roman"/>
+          <w:b w:val="0"/>
+          <w:sz w:val="24"/>
+        </w:rPr>
+        <w:t>BAB II</w:t>
+      </w:r>
+    </w:p>
+    <w:p>
+      <w:pPr>
+        <w:pStyle w:val="Heading1"/>
+        <w:jc w:val="center"/>
+      </w:pPr>
+      <w:r>
+        <w:rPr>
+          <w:rFonts w:ascii="Times New Roman" w:hAnsi="Times New Roman"/>
+          <w:b w:val="0"/>
+          <w:sz w:val="24"/>
+        </w:rPr>
+        <w:t>PEMBAHASAN</w:t>
+      </w:r>
+    </w:p>
+    <w:p>
+      <w:pPr>
+        <w:pStyle w:val="Heading2"/>
+      </w:pPr>
+      <w:r>
+        <w:rPr>
+          <w:rFonts w:ascii="Times New Roman" w:hAnsi="Times New Roman"/>
+          <w:b w:val="0"/>
+          <w:sz w:val="24"/>
+        </w:rPr>
+        <w:t>2.1 Desain dan Alur Aplikasi</w:t>
+      </w:r>
+    </w:p>
+    <w:p>
+      <w:pPr>
+        <w:ind w:firstLine="709"/>
+      </w:pPr>
+      <w:r>
+        <w:rPr>
+          <w:rFonts w:ascii="Times New Roman" w:hAnsi="Times New Roman"/>
+          <w:b w:val="0"/>
+          <w:sz w:val="24"/>
+        </w:rPr>
+        <w:t>Aplikasi menggunakan Material Design 3 dengan tema terang dan gelap. Alur utama dimulai dari dashboard, lalu pengguna dapat membuka form tambah/edit transaksi, halaman statistik, atau halaman pengaturan. Setelah transaksi disimpan, halaman sebelumnya menerima sinyal true dan memuat ulang data dari SQLite.</w:t>
+      </w:r>
+    </w:p>
+    <w:p>
+      <w:pPr>
         <w:jc w:val="center"/>
       </w:pPr>
       <w:r>
         <w:drawing>
           <wp:inline xmlns:a="http://schemas.openxmlformats.org/drawingml/2006/main" xmlns:pic="http://schemas.openxmlformats.org/drawingml/2006/picture">
-            <wp:extent cx="2286000" cy="2220809"/>
+            <wp:extent cx="4320000" cy="9348923"/>
             <wp:docPr id="1" name="Picture 1"/>
             <wp:cNvGraphicFramePr>
               <a:graphicFrameLocks noChangeAspect="1"/>
@@ -50,7 +554,7 @@
               <a:graphicData uri="http://schemas.openxmlformats.org/drawingml/2006/picture">
                 <pic:pic>
                   <pic:nvPicPr>
-                    <pic:cNvPr id="0" name="uin_malang_logo.png"/>
+                    <pic:cNvPr id="0" name="01_dashboard_light.png"/>
                     <pic:cNvPicPr/>
                   </pic:nvPicPr>
                   <pic:blipFill>
@@ -62,7 +566,7 @@
                   <pic:spPr>
                     <a:xfrm>
                       <a:off x="0" y="0"/>
-                      <a:ext cx="2286000" cy="2220809"/>
+                      <a:ext cx="4320000" cy="9348923"/>
                     </a:xfrm>
                     <a:prstGeom prst="rect"/>
                   </pic:spPr>
@@ -75,271 +579,21 @@
     </w:p>
     <w:p>
       <w:pPr>
-        <w:spacing w:line="312" w:lineRule="auto" w:after="720"/>
+        <w:spacing w:after="160"/>
         <w:jc w:val="center"/>
       </w:pPr>
       <w:r>
-        <w:rPr>
-          <w:b/>
-        </w:rPr>
-        <w:t>Disusun Oleh:</w:t>
-        <w:br/>
-      </w:r>
-      <w:r>
-        <w:rPr>
-          <w:b/>
-        </w:rPr>
-        <w:t>NOVAL DWI PAMUNGKAS</w:t>
-        <w:br/>
-        <w:t>NIM: 240605110040</w:t>
-        <w:br/>
-        <w:t>Kelas: A (Semester 5)</w:t>
-        <w:br/>
-        <w:br/>
-      </w:r>
-      <w:r>
-        <w:rPr>
-          <w:b/>
-        </w:rPr>
-        <w:t>Dosen Pengampu:</w:t>
-        <w:br/>
-        <w:t>A'la Syauqi, M.Kom</w:t>
+        <w:t>Gambar 2.1. Dashboard mode terang.</w:t>
       </w:r>
     </w:p>
     <w:p>
       <w:pPr>
-        <w:spacing w:line="276" w:lineRule="auto"/>
-        <w:jc w:val="center"/>
-      </w:pPr>
-      <w:r>
-        <w:rPr>
-          <w:b/>
-          <w:sz w:val="26"/>
-        </w:rPr>
-        <w:t>PROGRAM STUDI S1 TEKNIK INFORMATIKA</w:t>
-        <w:br/>
-        <w:t>FAKULTAS SAINS DAN TEKNOLOGI</w:t>
-        <w:br/>
-        <w:t>UNIVERSITAS ISLAM NEGERI MAULANA MALIK IBRAHIM MALANG</w:t>
-        <w:br/>
-        <w:t>2026</w:t>
-      </w:r>
-    </w:p>
-    <w:p>
-      <w:r>
-        <w:br w:type="page"/>
-      </w:r>
-    </w:p>
-    <w:p>
-      <w:pPr>
-        <w:spacing w:after="240"/>
-        <w:jc w:val="center"/>
-      </w:pPr>
-      <w:r>
-        <w:rPr>
-          <w:b/>
-          <w:sz w:val="28"/>
-        </w:rPr>
-        <w:t>BAB I</w:t>
-        <w:br/>
-        <w:t>PENDAHULUAN</w:t>
-      </w:r>
-    </w:p>
-    <w:p>
-      <w:pPr>
-        <w:spacing w:before="240" w:after="120"/>
-      </w:pPr>
-      <w:r>
-        <w:rPr>
-          <w:b/>
-          <w:sz w:val="24"/>
-        </w:rPr>
-        <w:t>1.1. Latar Belakang dan Gambaran Aplikasi</w:t>
-      </w:r>
-    </w:p>
-    <w:p>
-      <w:r>
-        <w:t>Pengelolaan keuangan pribadi merupakan aspek krusial dalam kehidupan sehari-hari, khususnya bagi kalangan mahasiswa dan masyarakat urban. Tantangan utama yang kerap dihadapi adalah kurangnya disiplin dan visibilitas terhadap arus keluar masuk kas harian, yang sering berujung pada perilaku konsumtif dan ketidakseimbangan finansial (defisit). Metode pencatatan manual menggunakan buku fisik atau spreadsheet konvensional seringkali ditinggalkan karena dinilai tidak praktis, mudah rusak, dan rentan hilang saat mobilitas tinggi.</w:t>
-      </w:r>
-    </w:p>
-    <w:p>
-      <w:r>
-        <w:t>Kemajuan teknologi informasi multiplatform memungkinkan pengembangan aplikasi yang dapat berjalan lancar di berbagai sistem operasi mobile maupun desktop menggunakan basis kode tunggal (*single codebase*). Melalui framework Flutter dan bahasa pemrograman Dart, aplikasi FinTrack (Financial Tracker) dikembangkan untuk memberikan solusi cerdas, cepat, dan intuitif dalam mencatat transaksi pemasukan maupun pengeluaran. FinTrack mengusung konsep *offline-first*, memastikan seluruh pencatatan data keuangan tetap dapat dilakukan secara mandiri tanpa bergantung pada ketersediaan koneksi internet.</w:t>
-      </w:r>
-    </w:p>
-    <w:p>
-      <w:r>
-        <w:t>Aplikasi FinTrack ditujukan bagi mahasiswa, pekerja lepas, profesional muda, hingga masyarakat umum yang membutuhkan alat bantu evaluasi arus kas. Sasaran utama pengembangan aplikasi ini adalah menghadirkan pengalaman pengguna (*user experience*) yang mulus melalui penerapan konsep *asynchronous programming* guna mencegah terjadinya *UI freeze* (pembekuan antarmuka) saat operasi penyimpanan data, serta memadukan dua teknik persistensi data lokal, yaitu SQLite (untuk data relasional terstruktur) dan SharedPreferences (untuk konfigurasi preferensi pengguna).</w:t>
-      </w:r>
-    </w:p>
-    <w:p>
-      <w:pPr>
-        <w:spacing w:before="240" w:after="120"/>
-      </w:pPr>
-      <w:r>
-        <w:rPr>
-          <w:b/>
-          <w:sz w:val="24"/>
-        </w:rPr>
-        <w:t>1.2. Fitur Aplikasi</w:t>
-      </w:r>
-    </w:p>
-    <w:p>
-      <w:r>
-        <w:t>Untuk menjawab kebutuhan pengelolaan arus kas, aplikasi FinTrack dilengkapi dengan fitur-fitur utama berikut:</w:t>
-      </w:r>
-    </w:p>
-    <w:p>
-      <w:pPr>
-        <w:spacing w:after="80"/>
-        <w:ind w:left="425"/>
-      </w:pPr>
-      <w:r>
-        <w:rPr>
-          <w:b/>
-        </w:rPr>
-        <w:t xml:space="preserve">• Dashboard Arus Kas Dinamis (Summary Card): </w:t>
-      </w:r>
-      <w:r>
-        <w:t>Menyajikan ringkasan total saldo bersih, total akumulasi pemasukan, dan total pengeluaran secara real-time. Dilengkapi dengan indikator status keuangan (Surplus/Defisit) dan progress bar visual pemakaian anggaran bulanan.</w:t>
-      </w:r>
-    </w:p>
-    <w:p>
-      <w:pPr>
-        <w:spacing w:after="80"/>
-        <w:ind w:left="425"/>
-      </w:pPr>
-      <w:r>
-        <w:rPr>
-          <w:b/>
-        </w:rPr>
-        <w:t xml:space="preserve">• Manajemen Catatan Transaksi Lengkap (CRUD SQLite): </w:t>
-      </w:r>
-      <w:r>
-        <w:t>Mendukung operasi Create (tambah transaksi baru dengan kategori, nominal Rupiah, tanggal, dan catatan tambahan), Read (tampilan riwayat transaksi berurutan kronologis terbaru), Update (edit transaksi secara instan), dan Delete (hapus data transaksi melalui gesture Swipe-to-Dismiss dengan konfirmasi dialog).</w:t>
-      </w:r>
-    </w:p>
-    <w:p>
-      <w:pPr>
-        <w:spacing w:after="80"/>
-        <w:ind w:left="425"/>
-      </w:pPr>
-      <w:r>
-        <w:rPr>
-          <w:b/>
-        </w:rPr>
-        <w:t xml:space="preserve">• Pencarian Real-Time dan Filter Kategori Cepat: </w:t>
-      </w:r>
-      <w:r>
-        <w:t>Memungkinkan pengguna menemukan transaksi spesifik secara instan berdasarkan kata kunci judul maupun kategori, serta menyaring transaksi berdasarkan tipe (Semua, Pemasukan, Pengeluaran).</w:t>
-      </w:r>
-    </w:p>
-    <w:p>
-      <w:pPr>
-        <w:spacing w:after="80"/>
-        <w:ind w:left="425"/>
-      </w:pPr>
-      <w:r>
-        <w:rPr>
-          <w:b/>
-        </w:rPr>
-        <w:t xml:space="preserve">• Visualisasi Statistik Finansial Per Kategori: </w:t>
-      </w:r>
-      <w:r>
-        <w:t>Menyajikan proporsi alokasi pengeluaran dan pemasukan per kategori menggunakan visualisasi progress bar persentase yang mudah dipahami.</w:t>
-      </w:r>
-    </w:p>
-    <w:p>
-      <w:pPr>
-        <w:spacing w:after="80"/>
-        <w:ind w:left="425"/>
-      </w:pPr>
-      <w:r>
-        <w:rPr>
-          <w:b/>
-        </w:rPr>
-        <w:t xml:space="preserve">• Banner Edukasi Finansial Dinamis (Simulasi Asinkron Jaringan): </w:t>
-      </w:r>
-      <w:r>
-        <w:t>Menampilkan kutipan dan tips bijak finansial yang dimuat secara asinkron dengan simulasi latensi jaringan (network delay), dilengkapi tombol refresh untuk memuat kutipan baru.</w:t>
-      </w:r>
-    </w:p>
-    <w:p>
-      <w:pPr>
-        <w:spacing w:after="80"/>
-        <w:ind w:left="425"/>
-      </w:pPr>
-      <w:r>
-        <w:rPr>
-          <w:b/>
-        </w:rPr>
-        <w:t xml:space="preserve">• Preferensi Pengguna Persisten (SharedPreferences): </w:t>
-      </w:r>
-      <w:r>
-        <w:t>Pengaturan tema aplikasi (Dark Mode / Light Mode) yang tersimpan permanen di memori lokal, kustomisasi nama profil pengguna untuk salam personal di header dashboard, serta penentuan batas anggaran bulanan (budget target).</w:t>
-      </w:r>
-    </w:p>
-    <w:p>
-      <w:pPr>
-        <w:spacing w:after="80"/>
-        <w:ind w:left="425"/>
-      </w:pPr>
-      <w:r>
-        <w:rPr>
-          <w:b/>
-        </w:rPr>
-        <w:t xml:space="preserve">• Manajemen dan Pembersihan Basis Data (Reset Database): </w:t>
-      </w:r>
-      <w:r>
-        <w:t>Menyediakan fasilitas pembersihan seluruh data transaksi di basis data SQLite dengan pengaman dialog konfirmasi ganda.</w:t>
-      </w:r>
-    </w:p>
-    <w:p>
-      <w:r>
-        <w:br w:type="page"/>
-      </w:r>
-    </w:p>
-    <w:p>
-      <w:pPr>
-        <w:spacing w:after="240"/>
-        <w:jc w:val="center"/>
-      </w:pPr>
-      <w:r>
-        <w:rPr>
-          <w:b/>
-          <w:sz w:val="28"/>
-        </w:rPr>
-        <w:t>BAB II</w:t>
-        <w:br/>
-        <w:t>PEMBAHASAN</w:t>
-      </w:r>
-    </w:p>
-    <w:p>
-      <w:pPr>
-        <w:spacing w:before="240" w:after="120"/>
-      </w:pPr>
-      <w:r>
-        <w:rPr>
-          <w:b/>
-          <w:sz w:val="24"/>
-        </w:rPr>
-        <w:t>2.1. Desain Antarmuka Pengguna (User Interface)</w:t>
-      </w:r>
-    </w:p>
-    <w:p>
-      <w:r>
-        <w:t>Desain antarmuka aplikasi FinTrack mengadopsi prinsip desain Material Design 3 dengan tata letak yang ergonomis dan kontras warna yang ramah mata. Aplikasi dirancang responsif terhadap mode tema, mendukung palet warna biru modern (#2563EB) pada mode terang dan slate/navy (#0B132B / #1C2541) pada mode gelap. Setiap elemen antarmuka dirancang untuk memberikan informasi secara hierarkis, mulai dari ringkasan saldo di bagian teratas hingga riwayat rinci di bagian bawah.</w:t>
-      </w:r>
-    </w:p>
-    <w:p>
-      <w:pPr>
-        <w:spacing w:before="160" w:after="80"/>
         <w:jc w:val="center"/>
       </w:pPr>
       <w:r>
         <w:drawing>
           <wp:inline xmlns:a="http://schemas.openxmlformats.org/drawingml/2006/main" xmlns:pic="http://schemas.openxmlformats.org/drawingml/2006/picture">
-            <wp:extent cx="2468880" cy="5342910"/>
+            <wp:extent cx="4320000" cy="9348923"/>
             <wp:docPr id="2" name="Picture 2"/>
             <wp:cNvGraphicFramePr>
               <a:graphicFrameLocks noChangeAspect="1"/>
@@ -348,7 +602,7 @@
               <a:graphicData uri="http://schemas.openxmlformats.org/drawingml/2006/picture">
                 <pic:pic>
                   <pic:nvPicPr>
-                    <pic:cNvPr id="0" name="01_dashboard_light.png"/>
+                    <pic:cNvPr id="0" name="02_dashboard_dark.png"/>
                     <pic:cNvPicPr/>
                   </pic:nvPicPr>
                   <pic:blipFill>
@@ -360,7 +614,7 @@
                   <pic:spPr>
                     <a:xfrm>
                       <a:off x="0" y="0"/>
-                      <a:ext cx="2468880" cy="5342910"/>
+                      <a:ext cx="4320000" cy="9348923"/>
                     </a:xfrm>
                     <a:prstGeom prst="rect"/>
                   </pic:spPr>
@@ -373,35 +627,21 @@
     </w:p>
     <w:p>
       <w:pPr>
-        <w:spacing w:after="120"/>
+        <w:spacing w:after="160"/>
         <w:jc w:val="center"/>
       </w:pPr>
       <w:r>
-        <w:rPr>
-          <w:b/>
-          <w:i/>
-          <w:sz w:val="21"/>
-        </w:rPr>
-        <w:t>Gambar 2.1 Tampilan Halaman Utama Dashboard (Mode Terang / Light Mode)</w:t>
+        <w:t>Gambar 2.2. Dashboard mode gelap.</w:t>
       </w:r>
     </w:p>
     <w:p>
       <w:pPr>
-        <w:spacing w:after="240"/>
-      </w:pPr>
-      <w:r>
-        <w:t>Halaman utama FinTrack pada mode terang menampilkan AppBar dengan avatar dan nama profil pengguna, kartu gradien ringkasan saldo bersih, total pemasukan, total pengeluaran, serta bar indikator pemakaian anggaran. Terdapat pula banner tips finansial asinkron, filter chip kategori, kotak pencarian, dan daftar riwayat transaksi.</w:t>
-      </w:r>
-    </w:p>
-    <w:p>
-      <w:pPr>
-        <w:spacing w:before="160" w:after="80"/>
         <w:jc w:val="center"/>
       </w:pPr>
       <w:r>
         <w:drawing>
           <wp:inline xmlns:a="http://schemas.openxmlformats.org/drawingml/2006/main" xmlns:pic="http://schemas.openxmlformats.org/drawingml/2006/picture">
-            <wp:extent cx="2468880" cy="5342910"/>
+            <wp:extent cx="4320000" cy="9348923"/>
             <wp:docPr id="3" name="Picture 3"/>
             <wp:cNvGraphicFramePr>
               <a:graphicFrameLocks noChangeAspect="1"/>
@@ -410,7 +650,7 @@
               <a:graphicData uri="http://schemas.openxmlformats.org/drawingml/2006/picture">
                 <pic:pic>
                   <pic:nvPicPr>
-                    <pic:cNvPr id="0" name="02_dashboard_dark.png"/>
+                    <pic:cNvPr id="0" name="03_form_tambah_transaksi.png"/>
                     <pic:cNvPicPr/>
                   </pic:nvPicPr>
                   <pic:blipFill>
@@ -422,7 +662,7 @@
                   <pic:spPr>
                     <a:xfrm>
                       <a:off x="0" y="0"/>
-                      <a:ext cx="2468880" cy="5342910"/>
+                      <a:ext cx="4320000" cy="9348923"/>
                     </a:xfrm>
                     <a:prstGeom prst="rect"/>
                   </pic:spPr>
@@ -435,35 +675,21 @@
     </w:p>
     <w:p>
       <w:pPr>
-        <w:spacing w:after="120"/>
+        <w:spacing w:after="160"/>
         <w:jc w:val="center"/>
       </w:pPr>
       <w:r>
-        <w:rPr>
-          <w:b/>
-          <w:i/>
-          <w:sz w:val="21"/>
-        </w:rPr>
-        <w:t>Gambar 2.2 Tampilan Halaman Utama Dashboard (Mode Gelap / Dark Mode)</w:t>
+        <w:t>Gambar 2.3. Form tambah transaksi.</w:t>
       </w:r>
     </w:p>
     <w:p>
       <w:pPr>
-        <w:spacing w:after="240"/>
-      </w:pPr>
-      <w:r>
-        <w:t>Tampilan dashboard dalam mode gelap (Dark Mode) yang meminimalkan kelelahan mata pengguna di kondisi pencahayaan rendah. Semua kartu dan latar belakang otomatis menyesuaikan kontras secara konsisten melalui state SharedPreferences.</w:t>
-      </w:r>
-    </w:p>
-    <w:p>
-      <w:pPr>
-        <w:spacing w:before="160" w:after="80"/>
         <w:jc w:val="center"/>
       </w:pPr>
       <w:r>
         <w:drawing>
           <wp:inline xmlns:a="http://schemas.openxmlformats.org/drawingml/2006/main" xmlns:pic="http://schemas.openxmlformats.org/drawingml/2006/picture">
-            <wp:extent cx="2468880" cy="5342910"/>
+            <wp:extent cx="4320000" cy="9348923"/>
             <wp:docPr id="4" name="Picture 4"/>
             <wp:cNvGraphicFramePr>
               <a:graphicFrameLocks noChangeAspect="1"/>
@@ -472,7 +698,7 @@
               <a:graphicData uri="http://schemas.openxmlformats.org/drawingml/2006/picture">
                 <pic:pic>
                   <pic:nvPicPr>
-                    <pic:cNvPr id="0" name="03_form_tambah_transaksi.png"/>
+                    <pic:cNvPr id="0" name="04_statistik_kategori.png"/>
                     <pic:cNvPicPr/>
                   </pic:nvPicPr>
                   <pic:blipFill>
@@ -484,7 +710,7 @@
                   <pic:spPr>
                     <a:xfrm>
                       <a:off x="0" y="0"/>
-                      <a:ext cx="2468880" cy="5342910"/>
+                      <a:ext cx="4320000" cy="9348923"/>
                     </a:xfrm>
                     <a:prstGeom prst="rect"/>
                   </pic:spPr>
@@ -497,35 +723,21 @@
     </w:p>
     <w:p>
       <w:pPr>
-        <w:spacing w:after="120"/>
+        <w:spacing w:after="160"/>
         <w:jc w:val="center"/>
       </w:pPr>
       <w:r>
-        <w:rPr>
-          <w:b/>
-          <w:i/>
-          <w:sz w:val="21"/>
-        </w:rPr>
-        <w:t>Gambar 2.3 Tampilan Form Tambah Transaksi Keuangan</w:t>
+        <w:t>Gambar 2.4. Statistik kategori.</w:t>
       </w:r>
     </w:p>
     <w:p>
       <w:pPr>
-        <w:spacing w:after="240"/>
-      </w:pPr>
-      <w:r>
-        <w:t>Formulir pencatatan transaksi yang dilengkapi tombol SegmentedButton untuk memilih jenis transaksi (Pengeluaran / Pemasukan), TextFormField judul, nominal numerik dalam Rupiah, dropdown pilihan kategori transaksi, pemilih tanggal kalender (DatePicker), serta catatan opsional dengan tombol simpan asinkron ke SQLite.</w:t>
-      </w:r>
-    </w:p>
-    <w:p>
-      <w:pPr>
-        <w:spacing w:before="160" w:after="80"/>
         <w:jc w:val="center"/>
       </w:pPr>
       <w:r>
         <w:drawing>
           <wp:inline xmlns:a="http://schemas.openxmlformats.org/drawingml/2006/main" xmlns:pic="http://schemas.openxmlformats.org/drawingml/2006/picture">
-            <wp:extent cx="2468880" cy="5342910"/>
+            <wp:extent cx="4320000" cy="9348923"/>
             <wp:docPr id="5" name="Picture 5"/>
             <wp:cNvGraphicFramePr>
               <a:graphicFrameLocks noChangeAspect="1"/>
@@ -534,7 +746,7 @@
               <a:graphicData uri="http://schemas.openxmlformats.org/drawingml/2006/picture">
                 <pic:pic>
                   <pic:nvPicPr>
-                    <pic:cNvPr id="0" name="04_statistik_kategori.png"/>
+                    <pic:cNvPr id="0" name="05_pengaturan_preferensi.png"/>
                     <pic:cNvPicPr/>
                   </pic:nvPicPr>
                   <pic:blipFill>
@@ -546,7 +758,7 @@
                   <pic:spPr>
                     <a:xfrm>
                       <a:off x="0" y="0"/>
-                      <a:ext cx="2468880" cy="5342910"/>
+                      <a:ext cx="4320000" cy="9348923"/>
                     </a:xfrm>
                     <a:prstGeom prst="rect"/>
                   </pic:spPr>
@@ -559,176 +771,112 @@
     </w:p>
     <w:p>
       <w:pPr>
-        <w:spacing w:after="120"/>
+        <w:spacing w:after="160"/>
         <w:jc w:val="center"/>
       </w:pPr>
       <w:r>
-        <w:rPr>
-          <w:b/>
-          <w:i/>
-          <w:sz w:val="21"/>
-        </w:rPr>
-        <w:t>Gambar 2.4 Tampilan Visualisasi Statistik Pengeluaran Per Kategori</w:t>
+        <w:t>Gambar 2.5. Pengaturan dan preferensi.</w:t>
       </w:r>
     </w:p>
     <w:p>
       <w:pPr>
-        <w:spacing w:after="240"/>
+        <w:pStyle w:val="Heading2"/>
       </w:pPr>
       <w:r>
-        <w:t>Halaman statistik menyajikan total akumulasi nominal pengeluaran dan visualisasi bar persentase kontribusi masing-masing kategori (seperti Pendidikan, Transportasi, dan Makanan) yang dihitung secara agregat SQL dari basis data.</w:t>
+        <w:rPr>
+          <w:rFonts w:ascii="Times New Roman" w:hAnsi="Times New Roman"/>
+          <w:b w:val="0"/>
+          <w:sz w:val="24"/>
+        </w:rPr>
+        <w:t>2.2 Struktur Project dan Package</w:t>
       </w:r>
     </w:p>
     <w:p>
       <w:pPr>
-        <w:spacing w:before="160" w:after="80"/>
-        <w:jc w:val="center"/>
+        <w:ind w:firstLine="709"/>
       </w:pPr>
       <w:r>
-        <w:drawing>
-          <wp:inline xmlns:a="http://schemas.openxmlformats.org/drawingml/2006/main" xmlns:pic="http://schemas.openxmlformats.org/drawingml/2006/picture">
-            <wp:extent cx="2468880" cy="5342910"/>
-            <wp:docPr id="6" name="Picture 6"/>
-            <wp:cNvGraphicFramePr>
-              <a:graphicFrameLocks noChangeAspect="1"/>
-            </wp:cNvGraphicFramePr>
-            <a:graphic>
-              <a:graphicData uri="http://schemas.openxmlformats.org/drawingml/2006/picture">
-                <pic:pic>
-                  <pic:nvPicPr>
-                    <pic:cNvPr id="0" name="05_pengaturan_preferensi.png"/>
-                    <pic:cNvPicPr/>
-                  </pic:nvPicPr>
-                  <pic:blipFill>
-                    <a:blip r:embed="rId14"/>
-                    <a:stretch>
-                      <a:fillRect/>
-                    </a:stretch>
-                  </pic:blipFill>
-                  <pic:spPr>
-                    <a:xfrm>
-                      <a:off x="0" y="0"/>
-                      <a:ext cx="2468880" cy="5342910"/>
-                    </a:xfrm>
-                    <a:prstGeom prst="rect"/>
-                  </pic:spPr>
-                </pic:pic>
-              </a:graphicData>
-            </a:graphic>
-          </wp:inline>
-        </w:drawing>
+        <w:rPr>
+          <w:rFonts w:ascii="Times New Roman" w:hAnsi="Times New Roman"/>
+          <w:b w:val="0"/>
+          <w:sz w:val="24"/>
+        </w:rPr>
+        <w:t>Kode dipisahkan berdasarkan tanggung jawab agar mudah dipelihara. Model menyimpan struktur transaksi, services menangani persistence dan proses asynchronous, screens menangani halaman, sedangkan widgets berisi komponen UI reusable.</w:t>
       </w:r>
     </w:p>
     <w:p>
       <w:pPr>
-        <w:spacing w:after="120"/>
-        <w:jc w:val="center"/>
+        <w:pStyle w:val="ListBullet"/>
+        <w:spacing w:line="360" w:lineRule="auto"/>
+        <w:jc w:val="both"/>
       </w:pPr>
       <w:r>
-        <w:rPr>
-          <w:b/>
-          <w:i/>
-          <w:sz w:val="21"/>
-        </w:rPr>
-        <w:t>Gambar 2.5 Tampilan Halaman Pengaturan dan Preferensi Pengguna</w:t>
+        <w:t>lib/models/transaction_model.dart — model dan serialisasi transaksi.</w:t>
       </w:r>
     </w:p>
     <w:p>
       <w:pPr>
-        <w:spacing w:after="240"/>
+        <w:pStyle w:val="ListBullet"/>
+        <w:spacing w:line="360" w:lineRule="auto"/>
+        <w:jc w:val="both"/>
       </w:pPr>
       <w:r>
-        <w:t>Halaman pengaturan mengelola preferensi SharedPreferences (toggle switch Mode Gelap, ubah nama pengguna, dan atur target budget bulanan), menu reset basis data SQLite, serta kartu informasi pengembang dan identitas mahasiswa.</w:t>
+        <w:t>lib/services/database_helper.dart — SQLite, query, CRUD, agregasi, dan FFI desktop.</w:t>
       </w:r>
     </w:p>
     <w:p>
       <w:pPr>
-        <w:spacing w:before="280" w:after="120"/>
+        <w:pStyle w:val="ListBullet"/>
+        <w:spacing w:line="360" w:lineRule="auto"/>
+        <w:jc w:val="both"/>
       </w:pPr>
       <w:r>
-        <w:rPr>
-          <w:b/>
-          <w:sz w:val="24"/>
-        </w:rPr>
-        <w:t>2.2. Persiapan Project dan Package</w:t>
+        <w:t>lib/services/preference_service.dart — SharedPreferences untuk preferensi pengguna.</w:t>
       </w:r>
     </w:p>
     <w:p>
+      <w:pPr>
+        <w:pStyle w:val="ListBullet"/>
+        <w:spacing w:line="360" w:lineRule="auto"/>
+        <w:jc w:val="both"/>
+      </w:pPr>
       <w:r>
-        <w:t>Pengembangan aplikasi diawali dengan pembuatan struktur project Flutter menggunakan perintah CLI:</w:t>
+        <w:t>lib/services/quote_service.dart — simulasi pemuatan tips finansial dengan Future.delayed.</w:t>
+      </w:r>
+    </w:p>
+    <w:p>
+      <w:pPr>
+        <w:pStyle w:val="ListBullet"/>
+        <w:spacing w:line="360" w:lineRule="auto"/>
+        <w:jc w:val="both"/>
+      </w:pPr>
+      <w:r>
+        <w:t>lib/screens/ — HomeScreen, AddEditTransactionScreen, StatisticsScreen, SettingsScreen.</w:t>
+      </w:r>
+    </w:p>
+    <w:p>
+      <w:pPr>
+        <w:pStyle w:val="ListBullet"/>
+        <w:spacing w:line="360" w:lineRule="auto"/>
+        <w:jc w:val="both"/>
+      </w:pPr>
+      <w:r>
+        <w:t>lib/widgets/ — SummaryCard dan TransactionCard.</w:t>
+      </w:r>
+    </w:p>
+    <w:p>
+      <w:pPr>
+        <w:pStyle w:val="ListBullet"/>
+        <w:spacing w:line="360" w:lineRule="auto"/>
+        <w:jc w:val="both"/>
+      </w:pPr>
+      <w:r>
+        <w:t>lib/main.dart — binding Flutter, inisialisasi locale id_ID, SQLite FFI, tema, dan entry point.</w:t>
       </w:r>
     </w:p>
     <w:tbl>
       <w:tblPr>
-        <w:tblW w:type="auto" w:w="0"/>
-        <w:jc w:val="center"/>
-        <w:tblLook w:firstColumn="1" w:firstRow="1" w:lastColumn="0" w:lastRow="0" w:noHBand="0" w:noVBand="1" w:val="04A0"/>
-      </w:tblPr>
-      <w:tblGrid>
-        <w:gridCol w:w="7937"/>
-      </w:tblGrid>
-      <w:tr>
-        <w:tc>
-          <w:tcPr>
-            <w:tcW w:type="dxa" w:w="7937"/>
-            <w:shd w:val="clear" w:color="auto" w:fill="F1F5F9"/>
-            <w:tcMar>
-              <w:top w:w="140" w:type="dxa"/>
-              <w:bottom w:w="140" w:type="dxa"/>
-              <w:left w:w="200" w:type="dxa"/>
-              <w:right w:w="200" w:type="dxa"/>
-            </w:tcMar>
-            <w:tcBorders>
-              <w:top w:val="single" w:sz="4" w:space="0" w:color="CBD5E1"/>
-              <w:left w:val="single" w:sz="4" w:space="0" w:color="CBD5E1"/>
-              <w:bottom w:val="single" w:sz="4" w:space="0" w:color="CBD5E1"/>
-              <w:right w:val="single" w:sz="4" w:space="0" w:color="CBD5E1"/>
-            </w:tcBorders>
-          </w:tcPr>
-          <w:p>
-            <w:pPr>
-              <w:spacing w:line="276" w:lineRule="auto" w:after="40" w:before="40"/>
-              <w:jc w:val="left"/>
-            </w:pPr>
-            <w:r>
-              <w:rPr>
-                <w:rFonts w:ascii="Consolas" w:hAnsi="Consolas"/>
-                <w:color w:val="1E293B"/>
-                <w:sz w:val="19"/>
-              </w:rPr>
-              <w:t>flutter create --org com.novaldwi --project-name fintrack_app fintrack_app</w:t>
-            </w:r>
-          </w:p>
-        </w:tc>
-      </w:tr>
-    </w:tbl>
-    <w:p>
-      <w:pPr>
-        <w:spacing w:after="80"/>
-      </w:pPr>
-    </w:p>
-    <w:p>
-      <w:r>
-        <w:t>Arsitektur kode diorganisasikan secara modular untuk memastikan keterbacaan, skalabilitas, dan pemisahan logika bisnis (*Separation of Concerns*). Struktur direktori lib dirancang sebagai berikut:</w:t>
-        <w:br/>
-        <w:t>• lib/models/ : Berisi definisi class TransactionModel beserta fungsi serialisasi toMap() dan fromMap().</w:t>
-        <w:br/>
-        <w:t>• lib/services/ : Berisi modul komunikasi data lokal, yaitu DatabaseHelper (SQLite), PreferenceService (SharedPreferences), dan QuoteService (Async Simulation).</w:t>
-        <w:br/>
-        <w:t>• lib/screens/ : Berisi antarmuka pengguna halaman HomeScreen, AddEditTransactionScreen, StatisticsScreen, dan SettingsScreen.</w:t>
-        <w:br/>
-        <w:t>• lib/widgets/ : Berisi komponen antarmuka yang dapat digunakan kembali (reusable components) seperti SummaryCard dan TransactionCard.</w:t>
-        <w:br/>
-        <w:t>• lib/main.dart : Titik masuk utama aplikasi (entry point) yang menangani inisialisasi awal dan konfigurasi tema persisten.</w:t>
-      </w:r>
-    </w:p>
-    <w:p>
-      <w:r>
-        <w:t>Berikut adalah daftar paket dependensi eksternal yang ditambahkan pada berkas pubspec.yaml beserta alasan fungsional penggunaannya:</w:t>
-      </w:r>
-    </w:p>
-    <w:tbl>
-      <w:tblPr>
+        <w:tblStyle w:val="TableGrid"/>
         <w:tblW w:type="auto" w:w="0"/>
         <w:jc w:val="center"/>
         <w:tblLook w:firstColumn="1" w:firstRow="1" w:lastColumn="0" w:lastRow="0" w:noHBand="0" w:noVBand="1" w:val="04A0"/>
@@ -742,21 +890,18 @@
         <w:tc>
           <w:tcPr>
             <w:tcW w:type="dxa" w:w="2646"/>
-            <w:shd w:val="clear" w:color="auto" w:fill="E2E8F0"/>
-            <w:tcMar>
-              <w:top w:w="120" w:type="dxa"/>
-              <w:bottom w:w="120" w:type="dxa"/>
-              <w:left w:w="150" w:type="dxa"/>
-              <w:right w:w="150" w:type="dxa"/>
-            </w:tcMar>
+            <w:shd w:fill="D9EAF7"/>
           </w:tcPr>
           <w:p>
             <w:pPr>
-              <w:jc w:val="center"/>
+              <w:spacing w:after="0"/>
             </w:pPr>
+            <w:r/>
             <w:r>
               <w:rPr>
+                <w:rFonts w:ascii="Times New Roman" w:hAnsi="Times New Roman"/>
                 <w:b/>
+                <w:sz w:val="20"/>
               </w:rPr>
               <w:t>Package</w:t>
             </w:r>
@@ -765,21 +910,18 @@
         <w:tc>
           <w:tcPr>
             <w:tcW w:type="dxa" w:w="2646"/>
-            <w:shd w:val="clear" w:color="auto" w:fill="E2E8F0"/>
-            <w:tcMar>
-              <w:top w:w="120" w:type="dxa"/>
-              <w:bottom w:w="120" w:type="dxa"/>
-              <w:left w:w="150" w:type="dxa"/>
-              <w:right w:w="150" w:type="dxa"/>
-            </w:tcMar>
+            <w:shd w:fill="D9EAF7"/>
           </w:tcPr>
           <w:p>
             <w:pPr>
-              <w:jc w:val="center"/>
+              <w:spacing w:after="0"/>
             </w:pPr>
+            <w:r/>
             <w:r>
               <w:rPr>
+                <w:rFonts w:ascii="Times New Roman" w:hAnsi="Times New Roman"/>
                 <w:b/>
+                <w:sz w:val="20"/>
               </w:rPr>
               <w:t>Versi</w:t>
             </w:r>
@@ -788,23 +930,20 @@
         <w:tc>
           <w:tcPr>
             <w:tcW w:type="dxa" w:w="2646"/>
-            <w:shd w:val="clear" w:color="auto" w:fill="E2E8F0"/>
-            <w:tcMar>
-              <w:top w:w="120" w:type="dxa"/>
-              <w:bottom w:w="120" w:type="dxa"/>
-              <w:left w:w="150" w:type="dxa"/>
-              <w:right w:w="150" w:type="dxa"/>
-            </w:tcMar>
+            <w:shd w:fill="D9EAF7"/>
           </w:tcPr>
           <w:p>
             <w:pPr>
-              <w:jc w:val="center"/>
+              <w:spacing w:after="0"/>
             </w:pPr>
+            <w:r/>
             <w:r>
               <w:rPr>
+                <w:rFonts w:ascii="Times New Roman" w:hAnsi="Times New Roman"/>
                 <w:b/>
+                <w:sz w:val="20"/>
               </w:rPr>
-              <w:t>Fungsi dan Alasan Penggunaan</w:t>
+              <w:t>Kegunaan</w:t>
             </w:r>
           </w:p>
         </w:tc>
@@ -813,20 +952,17 @@
         <w:tc>
           <w:tcPr>
             <w:tcW w:type="dxa" w:w="2646"/>
-            <w:tcMar>
-              <w:top w:w="80" w:type="dxa"/>
-              <w:bottom w:w="80" w:type="dxa"/>
-              <w:left w:w="120" w:type="dxa"/>
-              <w:right w:w="120" w:type="dxa"/>
-            </w:tcMar>
           </w:tcPr>
           <w:p>
             <w:pPr>
-              <w:spacing w:line="276" w:lineRule="auto" w:after="40"/>
+              <w:spacing w:after="0"/>
             </w:pPr>
+            <w:r/>
             <w:r>
               <w:rPr>
-                <w:b/>
+                <w:rFonts w:ascii="Times New Roman" w:hAnsi="Times New Roman"/>
+                <w:b w:val="0"/>
+                <w:sz w:val="20"/>
               </w:rPr>
               <w:t>sqflite</w:t>
             </w:r>
@@ -835,19 +971,18 @@
         <w:tc>
           <w:tcPr>
             <w:tcW w:type="dxa" w:w="2646"/>
-            <w:tcMar>
-              <w:top w:w="80" w:type="dxa"/>
-              <w:bottom w:w="80" w:type="dxa"/>
-              <w:left w:w="120" w:type="dxa"/>
-              <w:right w:w="120" w:type="dxa"/>
-            </w:tcMar>
           </w:tcPr>
           <w:p>
             <w:pPr>
-              <w:spacing w:line="276" w:lineRule="auto" w:after="40"/>
-              <w:jc w:val="center"/>
+              <w:spacing w:after="0"/>
             </w:pPr>
+            <w:r/>
             <w:r>
+              <w:rPr>
+                <w:rFonts w:ascii="Times New Roman" w:hAnsi="Times New Roman"/>
+                <w:b w:val="0"/>
+                <w:sz w:val="20"/>
+              </w:rPr>
               <w:t>^2.4.5</w:t>
             </w:r>
           </w:p>
@@ -855,19 +990,19 @@
         <w:tc>
           <w:tcPr>
             <w:tcW w:type="dxa" w:w="2646"/>
-            <w:tcMar>
-              <w:top w:w="80" w:type="dxa"/>
-              <w:bottom w:w="80" w:type="dxa"/>
-              <w:left w:w="120" w:type="dxa"/>
-              <w:right w:w="120" w:type="dxa"/>
-            </w:tcMar>
           </w:tcPr>
           <w:p>
             <w:pPr>
-              <w:spacing w:line="276" w:lineRule="auto" w:after="40"/>
+              <w:spacing w:after="0"/>
             </w:pPr>
+            <w:r/>
             <w:r>
-              <w:t>Menyediakan mesin basis data SQLite lokal untuk sistem operasi Android dan iOS, memungkinkan eksekusi query relasional terstruktur (CRUD).</w:t>
+              <w:rPr>
+                <w:rFonts w:ascii="Times New Roman" w:hAnsi="Times New Roman"/>
+                <w:b w:val="0"/>
+                <w:sz w:val="20"/>
+              </w:rPr>
+              <w:t>SQLite pada mobile</w:t>
             </w:r>
           </w:p>
         </w:tc>
@@ -876,20 +1011,17 @@
         <w:tc>
           <w:tcPr>
             <w:tcW w:type="dxa" w:w="2646"/>
-            <w:tcMar>
-              <w:top w:w="80" w:type="dxa"/>
-              <w:bottom w:w="80" w:type="dxa"/>
-              <w:left w:w="120" w:type="dxa"/>
-              <w:right w:w="120" w:type="dxa"/>
-            </w:tcMar>
           </w:tcPr>
           <w:p>
             <w:pPr>
-              <w:spacing w:line="276" w:lineRule="auto" w:after="40"/>
+              <w:spacing w:after="0"/>
             </w:pPr>
+            <w:r/>
             <w:r>
               <w:rPr>
-                <w:b/>
+                <w:rFonts w:ascii="Times New Roman" w:hAnsi="Times New Roman"/>
+                <w:b w:val="0"/>
+                <w:sz w:val="20"/>
               </w:rPr>
               <w:t>sqflite_common_ffi</w:t>
             </w:r>
@@ -898,19 +1030,18 @@
         <w:tc>
           <w:tcPr>
             <w:tcW w:type="dxa" w:w="2646"/>
-            <w:tcMar>
-              <w:top w:w="80" w:type="dxa"/>
-              <w:bottom w:w="80" w:type="dxa"/>
-              <w:left w:w="120" w:type="dxa"/>
-              <w:right w:w="120" w:type="dxa"/>
-            </w:tcMar>
           </w:tcPr>
           <w:p>
             <w:pPr>
-              <w:spacing w:line="276" w:lineRule="auto" w:after="40"/>
-              <w:jc w:val="center"/>
+              <w:spacing w:after="0"/>
             </w:pPr>
+            <w:r/>
             <w:r>
+              <w:rPr>
+                <w:rFonts w:ascii="Times New Roman" w:hAnsi="Times New Roman"/>
+                <w:b w:val="0"/>
+                <w:sz w:val="20"/>
+              </w:rPr>
               <w:t>^2.4.4</w:t>
             </w:r>
           </w:p>
@@ -918,19 +1049,19 @@
         <w:tc>
           <w:tcPr>
             <w:tcW w:type="dxa" w:w="2646"/>
-            <w:tcMar>
-              <w:top w:w="80" w:type="dxa"/>
-              <w:bottom w:w="80" w:type="dxa"/>
-              <w:left w:w="120" w:type="dxa"/>
-              <w:right w:w="120" w:type="dxa"/>
-            </w:tcMar>
           </w:tcPr>
           <w:p>
             <w:pPr>
-              <w:spacing w:line="276" w:lineRule="auto" w:after="40"/>
+              <w:spacing w:after="0"/>
             </w:pPr>
+            <w:r/>
             <w:r>
-              <w:t>Menyediakan binding FFI (Foreign Function Interface) untuk menjalankan SQLite pada lingkungan desktop (Windows) dan automated unit tests.</w:t>
+              <w:rPr>
+                <w:rFonts w:ascii="Times New Roman" w:hAnsi="Times New Roman"/>
+                <w:b w:val="0"/>
+                <w:sz w:val="20"/>
+              </w:rPr>
+              <w:t>SQLite desktop dan test</w:t>
             </w:r>
           </w:p>
         </w:tc>
@@ -939,20 +1070,17 @@
         <w:tc>
           <w:tcPr>
             <w:tcW w:type="dxa" w:w="2646"/>
-            <w:tcMar>
-              <w:top w:w="80" w:type="dxa"/>
-              <w:bottom w:w="80" w:type="dxa"/>
-              <w:left w:w="120" w:type="dxa"/>
-              <w:right w:w="120" w:type="dxa"/>
-            </w:tcMar>
           </w:tcPr>
           <w:p>
             <w:pPr>
-              <w:spacing w:line="276" w:lineRule="auto" w:after="40"/>
+              <w:spacing w:after="0"/>
             </w:pPr>
+            <w:r/>
             <w:r>
               <w:rPr>
-                <w:b/>
+                <w:rFonts w:ascii="Times New Roman" w:hAnsi="Times New Roman"/>
+                <w:b w:val="0"/>
+                <w:sz w:val="20"/>
               </w:rPr>
               <w:t>shared_preferences</w:t>
             </w:r>
@@ -961,19 +1089,18 @@
         <w:tc>
           <w:tcPr>
             <w:tcW w:type="dxa" w:w="2646"/>
-            <w:tcMar>
-              <w:top w:w="80" w:type="dxa"/>
-              <w:bottom w:w="80" w:type="dxa"/>
-              <w:left w:w="120" w:type="dxa"/>
-              <w:right w:w="120" w:type="dxa"/>
-            </w:tcMar>
           </w:tcPr>
           <w:p>
             <w:pPr>
-              <w:spacing w:line="276" w:lineRule="auto" w:after="40"/>
-              <w:jc w:val="center"/>
+              <w:spacing w:after="0"/>
             </w:pPr>
+            <w:r/>
             <w:r>
+              <w:rPr>
+                <w:rFonts w:ascii="Times New Roman" w:hAnsi="Times New Roman"/>
+                <w:b w:val="0"/>
+                <w:sz w:val="20"/>
+              </w:rPr>
               <w:t>^2.5.6</w:t>
             </w:r>
           </w:p>
@@ -981,19 +1108,19 @@
         <w:tc>
           <w:tcPr>
             <w:tcW w:type="dxa" w:w="2646"/>
-            <w:tcMar>
-              <w:top w:w="80" w:type="dxa"/>
-              <w:bottom w:w="80" w:type="dxa"/>
-              <w:left w:w="120" w:type="dxa"/>
-              <w:right w:w="120" w:type="dxa"/>
-            </w:tcMar>
           </w:tcPr>
           <w:p>
             <w:pPr>
-              <w:spacing w:line="276" w:lineRule="auto" w:after="40"/>
+              <w:spacing w:after="0"/>
             </w:pPr>
+            <w:r/>
             <w:r>
-              <w:t>Menyimpan data sederhana dalam bentuk pasangan kunci dan nilai (key-value) pada penyimpanan lokal perangkat secara persisten.</w:t>
+              <w:rPr>
+                <w:rFonts w:ascii="Times New Roman" w:hAnsi="Times New Roman"/>
+                <w:b w:val="0"/>
+                <w:sz w:val="20"/>
+              </w:rPr>
+              <w:t>Penyimpanan key-value</w:t>
             </w:r>
           </w:p>
         </w:tc>
@@ -1002,20 +1129,17 @@
         <w:tc>
           <w:tcPr>
             <w:tcW w:type="dxa" w:w="2646"/>
-            <w:tcMar>
-              <w:top w:w="80" w:type="dxa"/>
-              <w:bottom w:w="80" w:type="dxa"/>
-              <w:left w:w="120" w:type="dxa"/>
-              <w:right w:w="120" w:type="dxa"/>
-            </w:tcMar>
           </w:tcPr>
           <w:p>
             <w:pPr>
-              <w:spacing w:line="276" w:lineRule="auto" w:after="40"/>
+              <w:spacing w:after="0"/>
             </w:pPr>
+            <w:r/>
             <w:r>
               <w:rPr>
-                <w:b/>
+                <w:rFonts w:ascii="Times New Roman" w:hAnsi="Times New Roman"/>
+                <w:b w:val="0"/>
+                <w:sz w:val="20"/>
               </w:rPr>
               <w:t>path_provider</w:t>
             </w:r>
@@ -1024,19 +1148,18 @@
         <w:tc>
           <w:tcPr>
             <w:tcW w:type="dxa" w:w="2646"/>
-            <w:tcMar>
-              <w:top w:w="80" w:type="dxa"/>
-              <w:bottom w:w="80" w:type="dxa"/>
-              <w:left w:w="120" w:type="dxa"/>
-              <w:right w:w="120" w:type="dxa"/>
-            </w:tcMar>
           </w:tcPr>
           <w:p>
             <w:pPr>
-              <w:spacing w:line="276" w:lineRule="auto" w:after="40"/>
-              <w:jc w:val="center"/>
+              <w:spacing w:after="0"/>
             </w:pPr>
+            <w:r/>
             <w:r>
+              <w:rPr>
+                <w:rFonts w:ascii="Times New Roman" w:hAnsi="Times New Roman"/>
+                <w:b w:val="0"/>
+                <w:sz w:val="20"/>
+              </w:rPr>
               <w:t>^2.1.6</w:t>
             </w:r>
           </w:p>
@@ -1044,19 +1167,19 @@
         <w:tc>
           <w:tcPr>
             <w:tcW w:type="dxa" w:w="2646"/>
-            <w:tcMar>
-              <w:top w:w="80" w:type="dxa"/>
-              <w:bottom w:w="80" w:type="dxa"/>
-              <w:left w:w="120" w:type="dxa"/>
-              <w:right w:w="120" w:type="dxa"/>
-            </w:tcMar>
           </w:tcPr>
           <w:p>
             <w:pPr>
-              <w:spacing w:line="276" w:lineRule="auto" w:after="40"/>
+              <w:spacing w:after="0"/>
             </w:pPr>
+            <w:r/>
             <w:r>
-              <w:t>Mendeteksi lokasi direktori sistem yang sah dan aman untuk meletakkan berkas basis data SQLite pada perangkat pengguna.</w:t>
+              <w:rPr>
+                <w:rFonts w:ascii="Times New Roman" w:hAnsi="Times New Roman"/>
+                <w:b w:val="0"/>
+                <w:sz w:val="20"/>
+              </w:rPr>
+              <w:t>Lokasi database</w:t>
             </w:r>
           </w:p>
         </w:tc>
@@ -1065,20 +1188,17 @@
         <w:tc>
           <w:tcPr>
             <w:tcW w:type="dxa" w:w="2646"/>
-            <w:tcMar>
-              <w:top w:w="80" w:type="dxa"/>
-              <w:bottom w:w="80" w:type="dxa"/>
-              <w:left w:w="120" w:type="dxa"/>
-              <w:right w:w="120" w:type="dxa"/>
-            </w:tcMar>
           </w:tcPr>
           <w:p>
             <w:pPr>
-              <w:spacing w:line="276" w:lineRule="auto" w:after="40"/>
+              <w:spacing w:after="0"/>
             </w:pPr>
+            <w:r/>
             <w:r>
               <w:rPr>
-                <w:b/>
+                <w:rFonts w:ascii="Times New Roman" w:hAnsi="Times New Roman"/>
+                <w:b w:val="0"/>
+                <w:sz w:val="20"/>
               </w:rPr>
               <w:t>path</w:t>
             </w:r>
@@ -1087,19 +1207,18 @@
         <w:tc>
           <w:tcPr>
             <w:tcW w:type="dxa" w:w="2646"/>
-            <w:tcMar>
-              <w:top w:w="80" w:type="dxa"/>
-              <w:bottom w:w="80" w:type="dxa"/>
-              <w:left w:w="120" w:type="dxa"/>
-              <w:right w:w="120" w:type="dxa"/>
-            </w:tcMar>
           </w:tcPr>
           <w:p>
             <w:pPr>
-              <w:spacing w:line="276" w:lineRule="auto" w:after="40"/>
-              <w:jc w:val="center"/>
+              <w:spacing w:after="0"/>
             </w:pPr>
+            <w:r/>
             <w:r>
+              <w:rPr>
+                <w:rFonts w:ascii="Times New Roman" w:hAnsi="Times New Roman"/>
+                <w:b w:val="0"/>
+                <w:sz w:val="20"/>
+              </w:rPr>
               <w:t>^1.9.1</w:t>
             </w:r>
           </w:p>
@@ -1107,19 +1226,19 @@
         <w:tc>
           <w:tcPr>
             <w:tcW w:type="dxa" w:w="2646"/>
-            <w:tcMar>
-              <w:top w:w="80" w:type="dxa"/>
-              <w:bottom w:w="80" w:type="dxa"/>
-              <w:left w:w="120" w:type="dxa"/>
-              <w:right w:w="120" w:type="dxa"/>
-            </w:tcMar>
           </w:tcPr>
           <w:p>
             <w:pPr>
-              <w:spacing w:line="276" w:lineRule="auto" w:after="40"/>
+              <w:spacing w:after="0"/>
             </w:pPr>
+            <w:r/>
             <w:r>
-              <w:t>Utilitas untuk menyambungkan path berkas direktori (join path) secara aman lintas platform operasi.</w:t>
+              <w:rPr>
+                <w:rFonts w:ascii="Times New Roman" w:hAnsi="Times New Roman"/>
+                <w:b w:val="0"/>
+                <w:sz w:val="20"/>
+              </w:rPr>
+              <w:t>Manipulasi path</w:t>
             </w:r>
           </w:p>
         </w:tc>
@@ -1128,20 +1247,17 @@
         <w:tc>
           <w:tcPr>
             <w:tcW w:type="dxa" w:w="2646"/>
-            <w:tcMar>
-              <w:top w:w="80" w:type="dxa"/>
-              <w:bottom w:w="80" w:type="dxa"/>
-              <w:left w:w="120" w:type="dxa"/>
-              <w:right w:w="120" w:type="dxa"/>
-            </w:tcMar>
           </w:tcPr>
           <w:p>
             <w:pPr>
-              <w:spacing w:line="276" w:lineRule="auto" w:after="40"/>
+              <w:spacing w:after="0"/>
             </w:pPr>
+            <w:r/>
             <w:r>
               <w:rPr>
-                <w:b/>
+                <w:rFonts w:ascii="Times New Roman" w:hAnsi="Times New Roman"/>
+                <w:b w:val="0"/>
+                <w:sz w:val="20"/>
               </w:rPr>
               <w:t>intl</w:t>
             </w:r>
@@ -1150,19 +1266,18 @@
         <w:tc>
           <w:tcPr>
             <w:tcW w:type="dxa" w:w="2646"/>
-            <w:tcMar>
-              <w:top w:w="80" w:type="dxa"/>
-              <w:bottom w:w="80" w:type="dxa"/>
-              <w:left w:w="120" w:type="dxa"/>
-              <w:right w:w="120" w:type="dxa"/>
-            </w:tcMar>
           </w:tcPr>
           <w:p>
             <w:pPr>
-              <w:spacing w:line="276" w:lineRule="auto" w:after="40"/>
-              <w:jc w:val="center"/>
+              <w:spacing w:after="0"/>
             </w:pPr>
+            <w:r/>
             <w:r>
+              <w:rPr>
+                <w:rFonts w:ascii="Times New Roman" w:hAnsi="Times New Roman"/>
+                <w:b w:val="0"/>
+                <w:sz w:val="20"/>
+              </w:rPr>
               <w:t>^0.20.3</w:t>
             </w:r>
           </w:p>
@@ -1170,19 +1285,19 @@
         <w:tc>
           <w:tcPr>
             <w:tcW w:type="dxa" w:w="2646"/>
-            <w:tcMar>
-              <w:top w:w="80" w:type="dxa"/>
-              <w:bottom w:w="80" w:type="dxa"/>
-              <w:left w:w="120" w:type="dxa"/>
-              <w:right w:w="120" w:type="dxa"/>
-            </w:tcMar>
           </w:tcPr>
           <w:p>
             <w:pPr>
-              <w:spacing w:line="276" w:lineRule="auto" w:after="40"/>
+              <w:spacing w:after="0"/>
             </w:pPr>
+            <w:r/>
             <w:r>
-              <w:t>Memformat penulisan angka desimal ke mata uang Rupiah Indonesia (Rp) dan memformat tanggal sesuai kaidah bahasa lokal (id_ID).</w:t>
+              <w:rPr>
+                <w:rFonts w:ascii="Times New Roman" w:hAnsi="Times New Roman"/>
+                <w:b w:val="0"/>
+                <w:sz w:val="20"/>
+              </w:rPr>
+              <w:t>Format Rupiah dan tanggal id_ID</w:t>
             </w:r>
           </w:p>
         </w:tc>
@@ -1190,677 +1305,270 @@
     </w:tbl>
     <w:p>
       <w:pPr>
-        <w:spacing w:after="120"/>
+        <w:pStyle w:val="Heading2"/>
       </w:pPr>
+      <w:r>
+        <w:rPr>
+          <w:rFonts w:ascii="Times New Roman" w:hAnsi="Times New Roman"/>
+          <w:b w:val="0"/>
+          <w:sz w:val="24"/>
+        </w:rPr>
+        <w:t>2.3 Implementasi Asynchronous Programming</w:t>
+      </w:r>
     </w:p>
     <w:p>
       <w:pPr>
-        <w:spacing w:before="280" w:after="120"/>
+        <w:ind w:firstLine="709"/>
       </w:pPr>
       <w:r>
         <w:rPr>
-          <w:b/>
+          <w:rFonts w:ascii="Times New Roman" w:hAnsi="Times New Roman"/>
+          <w:b w:val="0"/>
           <w:sz w:val="24"/>
         </w:rPr>
-        <w:t>2.3. Implementasi Asynchronous Programming</w:t>
+        <w:t>Operasi I/O tidak dijalankan dengan cara blocking. HomeScreen memuat preferensi, transaksi, dan tips secara paralel menggunakan Future.wait. DatabaseHelper menggunakan Future, async, dan await untuk membuka database, insert, query, update, delete, serta agregasi. QuoteService memakai Future.delayed selama 800 milidetik untuk mensimulasikan pemanggilan data eksternal.</w:t>
       </w:r>
     </w:p>
     <w:p>
+      <w:pPr>
+        <w:spacing w:line="240" w:lineRule="auto"/>
+        <w:ind w:left="567" w:right="567"/>
+      </w:pPr>
       <w:r>
-        <w:t>Dalam ekosistem aplikasi Flutter, UI thread berjalan pada satu alur eksekusi (single-threaded event loop). Operasi seperti membaca dan menulis berkas ke penyimpanan fisik (disk I/O) atau mengambil data dari database lokal memerlukan durasi waktu yang tidak instan. Apabila operasi tersebut dijalankan secara sinkron (blocking), UI thread akan terhambat, menyebabkan antarmuka membeku (UI freeze/Jank) dan menurunkan kenyamanan pengguna. Oleh karena itu, konsep *asynchronous programming* menggunakan Future, async, dan await diterapkan secara menyeluruh.</w:t>
+        <w:rPr>
+          <w:rFonts w:ascii="Courier New" w:hAnsi="Courier New"/>
+          <w:sz w:val="18"/>
+        </w:rPr>
+        <w:t>await Future.wait([_loadPreferences(), _loadTransactions(), _loadDailyQuote()]);</w:t>
       </w:r>
     </w:p>
     <w:p>
+      <w:pPr>
+        <w:spacing w:line="240" w:lineRule="auto"/>
+        <w:ind w:left="567" w:right="567"/>
+      </w:pPr>
       <w:r>
-        <w:t>Berikut adalah implementasi inisialisasi simultan pada berkas lib/screens/home_screen.dart yang memanfaatkan Future.wait untuk memuat preferensi pengguna, daftar transaksi SQLite, dan kutipan finansial secara paralel tanpa saling menghambat:</w:t>
+        <w:rPr>
+          <w:rFonts w:ascii="Courier New" w:hAnsi="Courier New"/>
+          <w:sz w:val="18"/>
+        </w:rPr>
+        <w:t>await Future.delayed(const Duration(milliseconds: 800));</w:t>
+      </w:r>
+    </w:p>
+    <w:p>
+      <w:pPr>
+        <w:ind w:firstLine="709"/>
+      </w:pPr>
+      <w:r>
+        <w:rPr>
+          <w:rFonts w:ascii="Times New Roman" w:hAnsi="Times New Roman"/>
+          <w:b w:val="0"/>
+          <w:sz w:val="24"/>
+        </w:rPr>
+        <w:t>Untuk mengatasi error runtime saat format tanggal Indonesia, main.dart kini menginisialisasi data locale sebelum runApp:</w:t>
+      </w:r>
+    </w:p>
+    <w:p>
+      <w:pPr>
+        <w:spacing w:line="240" w:lineRule="auto"/>
+        <w:ind w:left="567" w:right="567"/>
+      </w:pPr>
+      <w:r>
+        <w:rPr>
+          <w:rFonts w:ascii="Courier New" w:hAnsi="Courier New"/>
+          <w:sz w:val="18"/>
+        </w:rPr>
+        <w:t>await initializeDateFormatting('id_ID');</w:t>
+      </w:r>
+    </w:p>
+    <w:p>
+      <w:pPr>
+        <w:pStyle w:val="Heading2"/>
+      </w:pPr>
+      <w:r>
+        <w:rPr>
+          <w:rFonts w:ascii="Times New Roman" w:hAnsi="Times New Roman"/>
+          <w:b w:val="0"/>
+          <w:sz w:val="24"/>
+        </w:rPr>
+        <w:t>2.4 Implementasi Data Persistence</w:t>
+      </w:r>
+    </w:p>
+    <w:p>
+      <w:pPr>
+        <w:ind w:firstLine="709"/>
+      </w:pPr>
+      <w:r>
+        <w:rPr>
+          <w:rFonts w:ascii="Times New Roman" w:hAnsi="Times New Roman"/>
+          <w:b w:val="0"/>
+          <w:sz w:val="24"/>
+        </w:rPr>
+        <w:t>SQLite menyimpan tabel transactions dengan kolom id, title, amount, type, category, date, dan note. DatabaseHelper menyediakan insertTransaction, getAllTransactions, getSummaryTotals, getCategoryBreakdown, updateTransaction, deleteTransaction, dan clearAllTransactions. Query memakai parameter whereArgs untuk filter yang aman.</w:t>
+      </w:r>
+    </w:p>
+    <w:p>
+      <w:pPr>
+        <w:ind w:firstLine="709"/>
+      </w:pPr>
+      <w:r>
+        <w:rPr>
+          <w:rFonts w:ascii="Times New Roman" w:hAnsi="Times New Roman"/>
+          <w:b w:val="0"/>
+          <w:sz w:val="24"/>
+        </w:rPr>
+        <w:t>SharedPreferences menyimpan is_dark_mode, user_name, dan monthly_budget. Nilai default yang digunakan adalah tema terang, nama Noval Dwi Pamungkas, dan anggaran Rp2.500.000.</w:t>
+      </w:r>
+    </w:p>
+    <w:p>
+      <w:pPr>
+        <w:spacing w:line="240" w:lineRule="auto"/>
+        <w:ind w:left="567" w:right="567"/>
+      </w:pPr>
+      <w:r>
+        <w:rPr>
+          <w:rFonts w:ascii="Courier New" w:hAnsi="Courier New"/>
+          <w:sz w:val="18"/>
+        </w:rPr>
+        <w:t>CREATE TABLE transactions (id INTEGER PRIMARY KEY AUTOINCREMENT, title TEXT NOT NULL, amount REAL NOT NULL, type TEXT NOT NULL, category TEXT NOT NULL, date TEXT NOT NULL, note TEXT);</w:t>
+      </w:r>
+    </w:p>
+    <w:p>
+      <w:pPr>
+        <w:pStyle w:val="Heading2"/>
+      </w:pPr>
+      <w:r>
+        <w:rPr>
+          <w:rFonts w:ascii="Times New Roman" w:hAnsi="Times New Roman"/>
+          <w:b w:val="0"/>
+          <w:sz w:val="24"/>
+        </w:rPr>
+        <w:t>2.5 Debugging dan Revisi</w:t>
+      </w:r>
+    </w:p>
+    <w:p>
+      <w:pPr>
+        <w:ind w:firstLine="709"/>
+      </w:pPr>
+      <w:r>
+        <w:rPr>
+          <w:rFonts w:ascii="Times New Roman" w:hAnsi="Times New Roman"/>
+          <w:b w:val="0"/>
+          <w:sz w:val="24"/>
+        </w:rPr>
+        <w:t>Pada pengujian Android ditemukan dua masalah runtime/build. Pertama, LocaleDataException muncul ketika DateFormat id_ID dipakai sebelum locale diinisialisasi. Masalah diperbaiki dengan initializeDateFormatting('id_ID') di main.dart. Kedua, Kotlin incremental cache gagal ditutup karena project berada di drive D: sedangkan Pub Cache berada di drive C:. Perbaikan diterapkan pada android/gradle.properties dengan menonaktifkan cache incremental Kotlin dan menjalankan compiler in-process.</w:t>
+      </w:r>
+    </w:p>
+    <w:p>
+      <w:pPr>
+        <w:spacing w:line="240" w:lineRule="auto"/>
+        <w:ind w:left="567" w:right="567"/>
+      </w:pPr>
+      <w:r>
+        <w:rPr>
+          <w:rFonts w:ascii="Courier New" w:hAnsi="Courier New"/>
+          <w:sz w:val="18"/>
+        </w:rPr>
+        <w:t>kotlin.incremental=false</w:t>
+        <w:br/>
+        <w:t>kotlin.compiler.execution.strategy=in-process</w:t>
+      </w:r>
+    </w:p>
+    <w:p>
+      <w:pPr>
+        <w:pStyle w:val="Heading2"/>
+      </w:pPr>
+      <w:r>
+        <w:rPr>
+          <w:rFonts w:ascii="Times New Roman" w:hAnsi="Times New Roman"/>
+          <w:b w:val="0"/>
+          <w:sz w:val="24"/>
+        </w:rPr>
+        <w:t>2.6 Pengujian</w:t>
+      </w:r>
+    </w:p>
+    <w:p>
+      <w:pPr>
+        <w:ind w:firstLine="709"/>
+      </w:pPr>
+      <w:r>
+        <w:rPr>
+          <w:rFonts w:ascii="Times New Roman" w:hAnsi="Times New Roman"/>
+          <w:b w:val="0"/>
+          <w:sz w:val="24"/>
+        </w:rPr>
+        <w:t>Pengujian dilakukan dengan flutter analyze, flutter test, dan flutter build apk --debug. Hasil aktual: analyzer tidak menemukan masalah, 10 test berhasil, dan APK debug berhasil dibuat.</w:t>
       </w:r>
     </w:p>
     <w:tbl>
       <w:tblPr>
+        <w:tblStyle w:val="TableGrid"/>
         <w:tblW w:type="auto" w:w="0"/>
         <w:jc w:val="center"/>
         <w:tblLook w:firstColumn="1" w:firstRow="1" w:lastColumn="0" w:lastRow="0" w:noHBand="0" w:noVBand="1" w:val="04A0"/>
       </w:tblPr>
       <w:tblGrid>
-        <w:gridCol w:w="7937"/>
+        <w:gridCol w:w="1984"/>
+        <w:gridCol w:w="1984"/>
+        <w:gridCol w:w="1984"/>
+        <w:gridCol w:w="1984"/>
       </w:tblGrid>
       <w:tr>
         <w:tc>
           <w:tcPr>
-            <w:tcW w:type="dxa" w:w="7937"/>
-            <w:shd w:val="clear" w:color="auto" w:fill="F1F5F9"/>
-            <w:tcMar>
-              <w:top w:w="140" w:type="dxa"/>
-              <w:bottom w:w="140" w:type="dxa"/>
-              <w:left w:w="200" w:type="dxa"/>
-              <w:right w:w="200" w:type="dxa"/>
-            </w:tcMar>
-            <w:tcBorders>
-              <w:top w:val="single" w:sz="4" w:space="0" w:color="CBD5E1"/>
-              <w:left w:val="single" w:sz="4" w:space="0" w:color="CBD5E1"/>
-              <w:bottom w:val="single" w:sz="4" w:space="0" w:color="CBD5E1"/>
-              <w:right w:val="single" w:sz="4" w:space="0" w:color="CBD5E1"/>
-            </w:tcBorders>
+            <w:tcW w:type="dxa" w:w="1984"/>
+            <w:shd w:fill="D9EAF7"/>
           </w:tcPr>
           <w:p>
             <w:pPr>
-              <w:spacing w:line="276" w:lineRule="auto" w:after="40" w:before="40"/>
-              <w:jc w:val="left"/>
+              <w:spacing w:after="0"/>
             </w:pPr>
+            <w:r/>
             <w:r>
               <w:rPr>
-                <w:rFonts w:ascii="Consolas" w:hAnsi="Consolas"/>
-                <w:color w:val="1E293B"/>
-                <w:sz w:val="19"/>
+                <w:rFonts w:ascii="Times New Roman" w:hAnsi="Times New Roman"/>
+                <w:b/>
+                <w:sz w:val="20"/>
               </w:rPr>
-              <w:t>// Memuat seluruh sumber data lokal secara paralel tanpa memblokir UI thread</w:t>
-              <w:br/>
-              <w:t>Future&lt;void&gt; _loadAllInitialData() async {</w:t>
-              <w:br/>
-              <w:t xml:space="preserve">  setState(() =&gt; _isLoadingData = true); // Tampilkan indikator loading</w:t>
-              <w:br/>
-              <w:t xml:space="preserve">  </w:t>
-              <w:br/>
-              <w:t xml:space="preserve">  // Menjalankan 3 proses asinkron secara simultan menggunakan Future.wait</w:t>
-              <w:br/>
-              <w:t xml:space="preserve">  await Future.wait([</w:t>
-              <w:br/>
-              <w:t xml:space="preserve">    _loadPreferences(),   // Membaca SharedPreferences (Key-Value)</w:t>
-              <w:br/>
-              <w:t xml:space="preserve">    _loadTransactions(),  // Query database SQLite (Structured)</w:t>
-              <w:br/>
-              <w:t xml:space="preserve">    _loadDailyQuote(),    // Simulasi pengambilan kutipan edukasi finansial</w:t>
-              <w:br/>
-              <w:t xml:space="preserve">  ]);</w:t>
-              <w:br/>
-              <w:br/>
-              <w:t xml:space="preserve">  if (mounted) {</w:t>
-              <w:br/>
-              <w:t xml:space="preserve">    setState(() =&gt; _isLoadingData = false); // Perbarui UI saat data siap</w:t>
-              <w:br/>
-              <w:t xml:space="preserve">  }</w:t>
-              <w:br/>
-              <w:t>}</w:t>
-            </w:r>
-          </w:p>
-        </w:tc>
-      </w:tr>
-    </w:tbl>
-    <w:p>
-      <w:pPr>
-        <w:spacing w:after="80"/>
-      </w:pPr>
-    </w:p>
-    <w:p>
-      <w:r>
-        <w:t>Fungsi di atas menunjukkan penanganan proses yang sedang berlangsung: variabel boolean _isLoadingData diatur bernilai true pada awal pemanggilan, sehingga antarmuka menampilkan CircularProgressIndicator. Begitu ketiga operasi asinkron selesai diselesaikan oleh Dart Event Loop via kata kunci await, variabel _isLoadingData diubah kembali menjadi false, dan data hasil pembacaan dirender ke layar secara mulus.</w:t>
-      </w:r>
-    </w:p>
-    <w:p>
-      <w:r>
-        <w:t>Selain itu, pada berkas lib/services/quote_service.dart, diterapkan simulasi latensi jaringan menggunakan Future.delayed untuk merepresentasikan pemanggilan REST API ke server eksternal:</w:t>
-      </w:r>
-    </w:p>
-    <w:tbl>
-      <w:tblPr>
-        <w:tblW w:type="auto" w:w="0"/>
-        <w:jc w:val="center"/>
-        <w:tblLook w:firstColumn="1" w:firstRow="1" w:lastColumn="0" w:lastRow="0" w:noHBand="0" w:noVBand="1" w:val="04A0"/>
-      </w:tblPr>
-      <w:tblGrid>
-        <w:gridCol w:w="7937"/>
-      </w:tblGrid>
-      <w:tr>
-        <w:tc>
-          <w:tcPr>
-            <w:tcW w:type="dxa" w:w="7937"/>
-            <w:shd w:val="clear" w:color="auto" w:fill="F1F5F9"/>
-            <w:tcMar>
-              <w:top w:w="140" w:type="dxa"/>
-              <w:bottom w:w="140" w:type="dxa"/>
-              <w:left w:w="200" w:type="dxa"/>
-              <w:right w:w="200" w:type="dxa"/>
-            </w:tcMar>
-            <w:tcBorders>
-              <w:top w:val="single" w:sz="4" w:space="0" w:color="CBD5E1"/>
-              <w:left w:val="single" w:sz="4" w:space="0" w:color="CBD5E1"/>
-              <w:bottom w:val="single" w:sz="4" w:space="0" w:color="CBD5E1"/>
-              <w:right w:val="single" w:sz="4" w:space="0" w:color="CBD5E1"/>
-            </w:tcBorders>
-          </w:tcPr>
-          <w:p>
-            <w:pPr>
-              <w:spacing w:line="276" w:lineRule="auto" w:after="40" w:before="40"/>
-              <w:jc w:val="left"/>
-            </w:pPr>
-            <w:r>
-              <w:rPr>
-                <w:rFonts w:ascii="Consolas" w:hAnsi="Consolas"/>
-                <w:color w:val="1E293B"/>
-                <w:sz w:val="19"/>
-              </w:rPr>
-              <w:t>// Simulasi asinkron pemanggilan data eksternal dengan latensi jaringan</w:t>
-              <w:br/>
-              <w:t>static Future&lt;String&gt; fetchDailyFinancialTip() async {</w:t>
-              <w:br/>
-              <w:t xml:space="preserve">  // Menunggu 800 milidetik seolah-olah mengambil data dari cloud server</w:t>
-              <w:br/>
-              <w:t xml:space="preserve">  await Future.delayed(const Duration(milliseconds: 800));</w:t>
-              <w:br/>
-              <w:br/>
-              <w:t xml:space="preserve">  final random = Random();</w:t>
-              <w:br/>
-              <w:t xml:space="preserve">  final index = random.nextInt(_tips.length);</w:t>
-              <w:br/>
-              <w:t xml:space="preserve">  return _tips[index]; // Mengembalikan kutipan finansial terpilih</w:t>
-              <w:br/>
-              <w:t>}</w:t>
-            </w:r>
-          </w:p>
-        </w:tc>
-      </w:tr>
-    </w:tbl>
-    <w:p>
-      <w:pPr>
-        <w:spacing w:after="80"/>
-      </w:pPr>
-    </w:p>
-    <w:p>
-      <w:pPr>
-        <w:spacing w:before="280" w:after="120"/>
-      </w:pPr>
-      <w:r>
-        <w:rPr>
-          <w:b/>
-          <w:sz w:val="24"/>
-        </w:rPr>
-        <w:t>2.4. Implementasi Data Persistence</w:t>
-      </w:r>
-    </w:p>
-    <w:p>
-      <w:r>
-        <w:t>Aplikasi FinTrack menerapkan dua teknik penyimpanan data lokal (*data persistence*) yang dipilih sesuai kebutuhan fungsional aplikasi:</w:t>
-      </w:r>
-    </w:p>
-    <w:p>
-      <w:pPr>
-        <w:spacing w:before="160" w:after="80"/>
-      </w:pPr>
-      <w:r>
-        <w:rPr>
-          <w:b/>
-          <w:sz w:val="23"/>
-        </w:rPr>
-        <w:t>2.4.1. Teknik Pertama: Shared Preferences (Key-Value Storage)</w:t>
-      </w:r>
-    </w:p>
-    <w:p>
-      <w:r>
-        <w:t>Alasan Pemilihan: SharedPreferences sangat ideal untuk menyimpan data preferensi aplikasi yang berukuran kecil, sederhana, dan tidak memerlukan skema relasional yang rumit. Menggunakan database relasional hanya untuk menyimpan status tema merupakan pemborosan sumber daya (*overhead*), sehingga SharedPreferences menjadi pilihan yang tepat dan efisien.</w:t>
-      </w:r>
-    </w:p>
-    <w:p>
-      <w:r>
-        <w:t>Jenis Data yang Disimpan: Tiga atribut preferensi pengguna disimpan, yaitu:</w:t>
-        <w:br/>
-        <w:t>1. is_dark_mode (Tipe boolean): Menyimpan status tema gelap (true) atau terang (false).</w:t>
-        <w:br/>
-        <w:t>2. user_name (Tipe String): Menyimpan nama lengkap pengguna (default: 'Noval Dwi Pamungkas') untuk sapaan dashboard.</w:t>
-        <w:br/>
-        <w:t>3. monthly_budget (Tipe double): Menyimpan target anggaran pengeluaran bulanan (default: Rp 2.500.000).</w:t>
-      </w:r>
-    </w:p>
-    <w:p>
-      <w:r>
-        <w:t>Proses Pembacaan dan Penyimpanan: SharedPreferences diakses secara asinkron melalui instance tunggal SharedPreferences.getInstance(). Berikut adalah potongan kode implementasi pada berkas lib/services/preference_service.dart:</w:t>
-      </w:r>
-    </w:p>
-    <w:tbl>
-      <w:tblPr>
-        <w:tblW w:type="auto" w:w="0"/>
-        <w:jc w:val="center"/>
-        <w:tblLook w:firstColumn="1" w:firstRow="1" w:lastColumn="0" w:lastRow="0" w:noHBand="0" w:noVBand="1" w:val="04A0"/>
-      </w:tblPr>
-      <w:tblGrid>
-        <w:gridCol w:w="7937"/>
-      </w:tblGrid>
-      <w:tr>
-        <w:tc>
-          <w:tcPr>
-            <w:tcW w:type="dxa" w:w="7937"/>
-            <w:shd w:val="clear" w:color="auto" w:fill="F1F5F9"/>
-            <w:tcMar>
-              <w:top w:w="140" w:type="dxa"/>
-              <w:bottom w:w="140" w:type="dxa"/>
-              <w:left w:w="200" w:type="dxa"/>
-              <w:right w:w="200" w:type="dxa"/>
-            </w:tcMar>
-            <w:tcBorders>
-              <w:top w:val="single" w:sz="4" w:space="0" w:color="CBD5E1"/>
-              <w:left w:val="single" w:sz="4" w:space="0" w:color="CBD5E1"/>
-              <w:bottom w:val="single" w:sz="4" w:space="0" w:color="CBD5E1"/>
-              <w:right w:val="single" w:sz="4" w:space="0" w:color="CBD5E1"/>
-            </w:tcBorders>
-          </w:tcPr>
-          <w:p>
-            <w:pPr>
-              <w:spacing w:line="276" w:lineRule="auto" w:after="40" w:before="40"/>
-              <w:jc w:val="left"/>
-            </w:pPr>
-            <w:r>
-              <w:rPr>
-                <w:rFonts w:ascii="Consolas" w:hAnsi="Consolas"/>
-                <w:color w:val="1E293B"/>
-                <w:sz w:val="19"/>
-              </w:rPr>
-              <w:t>class PreferenceService {</w:t>
-              <w:br/>
-              <w:t xml:space="preserve">  static const String _keyDarkMode = 'is_dark_mode';</w:t>
-              <w:br/>
-              <w:t xml:space="preserve">  static const String _keyUserName = 'user_name';</w:t>
-              <w:br/>
-              <w:t xml:space="preserve">  static const String _keyMonthlyBudget = 'monthly_budget';</w:t>
-              <w:br/>
-              <w:br/>
-              <w:t xml:space="preserve">  // Membaca status tema gelap/terang secara asinkron</w:t>
-              <w:br/>
-              <w:t xml:space="preserve">  static Future&lt;bool&gt; isDarkMode() async {</w:t>
-              <w:br/>
-              <w:t xml:space="preserve">    final prefs = await SharedPreferences.getInstance();</w:t>
-              <w:br/>
-              <w:t xml:space="preserve">    return prefs.getBool(_keyDarkMode) ?? false; // Default: false (Light Mode)</w:t>
-              <w:br/>
-              <w:t xml:space="preserve">  }</w:t>
-              <w:br/>
-              <w:br/>
-              <w:t xml:space="preserve">  // Menyimpan perubahan tema ke memori lokal</w:t>
-              <w:br/>
-              <w:t xml:space="preserve">  static Future&lt;bool&gt; setDarkMode(bool value) async {</w:t>
-              <w:br/>
-              <w:t xml:space="preserve">    final prefs = await SharedPreferences.getInstance();</w:t>
-              <w:br/>
-              <w:t xml:space="preserve">    return await prefs.setBool(_keyDarkMode, value);</w:t>
-              <w:br/>
-              <w:t xml:space="preserve">  }</w:t>
-              <w:br/>
-              <w:br/>
-              <w:t xml:space="preserve">  // Membaca nama pengguna yang tersimpan</w:t>
-              <w:br/>
-              <w:t xml:space="preserve">  static Future&lt;String&gt; getUserName() async {</w:t>
-              <w:br/>
-              <w:t xml:space="preserve">    final prefs = await SharedPreferences.getInstance();</w:t>
-              <w:br/>
-              <w:t xml:space="preserve">    return prefs.getString(_keyUserName) ?? 'Noval Dwi Pamungkas';</w:t>
-              <w:br/>
-              <w:t xml:space="preserve">  }</w:t>
-              <w:br/>
-              <w:br/>
-              <w:t xml:space="preserve">  // Menyimpan nama pengguna baru</w:t>
-              <w:br/>
-              <w:t xml:space="preserve">  static Future&lt;bool&gt; setUserName(String name) async {</w:t>
-              <w:br/>
-              <w:t xml:space="preserve">    final prefs = await SharedPreferences.getInstance();</w:t>
-              <w:br/>
-              <w:t xml:space="preserve">    return await prefs.setString(_keyUserName, name.trim());</w:t>
-              <w:br/>
-              <w:t xml:space="preserve">  }</w:t>
-              <w:br/>
-              <w:t>}</w:t>
-            </w:r>
-          </w:p>
-        </w:tc>
-      </w:tr>
-    </w:tbl>
-    <w:p>
-      <w:pPr>
-        <w:spacing w:after="80"/>
-      </w:pPr>
-    </w:p>
-    <w:p>
-      <w:pPr>
-        <w:spacing w:before="160" w:after="80"/>
-      </w:pPr>
-      <w:r>
-        <w:rPr>
-          <w:b/>
-          <w:sz w:val="23"/>
-        </w:rPr>
-        <w:t>2.4.2. Teknik Kedua: SQLite (Structured Database Storage)</w:t>
-      </w:r>
-    </w:p>
-    <w:p>
-      <w:r>
-        <w:t>Alasan Pemilihan: SQLite dipilih karena data catatan keuangan merupakan data transaksional terstruktur yang memiliki banyak kolom (id, judul, nominal, tipe, kategori, tanggal, catatan) dan memerlukan kemampuan query canggih seperti pengurutan waktu (ORDER BY date DESC), pencarian teks (LIKE), filter tipe, dan operasi agregasi matematis (SUM).</w:t>
-      </w:r>
-    </w:p>
-    <w:p>
-      <w:r>
-        <w:t>Skema Basis Data: Basis data diberi nama fintrack.db dengan satu tabel utama transactions yang didefinisikan sebagai berikut:</w:t>
-      </w:r>
-    </w:p>
-    <w:tbl>
-      <w:tblPr>
-        <w:tblW w:type="auto" w:w="0"/>
-        <w:jc w:val="center"/>
-        <w:tblLook w:firstColumn="1" w:firstRow="1" w:lastColumn="0" w:lastRow="0" w:noHBand="0" w:noVBand="1" w:val="04A0"/>
-      </w:tblPr>
-      <w:tblGrid>
-        <w:gridCol w:w="7937"/>
-      </w:tblGrid>
-      <w:tr>
-        <w:tc>
-          <w:tcPr>
-            <w:tcW w:type="dxa" w:w="7937"/>
-            <w:shd w:val="clear" w:color="auto" w:fill="F1F5F9"/>
-            <w:tcMar>
-              <w:top w:w="140" w:type="dxa"/>
-              <w:bottom w:w="140" w:type="dxa"/>
-              <w:left w:w="200" w:type="dxa"/>
-              <w:right w:w="200" w:type="dxa"/>
-            </w:tcMar>
-            <w:tcBorders>
-              <w:top w:val="single" w:sz="4" w:space="0" w:color="CBD5E1"/>
-              <w:left w:val="single" w:sz="4" w:space="0" w:color="CBD5E1"/>
-              <w:bottom w:val="single" w:sz="4" w:space="0" w:color="CBD5E1"/>
-              <w:right w:val="single" w:sz="4" w:space="0" w:color="CBD5E1"/>
-            </w:tcBorders>
-          </w:tcPr>
-          <w:p>
-            <w:pPr>
-              <w:spacing w:line="276" w:lineRule="auto" w:after="40" w:before="40"/>
-              <w:jc w:val="left"/>
-            </w:pPr>
-            <w:r>
-              <w:rPr>
-                <w:rFonts w:ascii="Consolas" w:hAnsi="Consolas"/>
-                <w:color w:val="1E293B"/>
-                <w:sz w:val="19"/>
-              </w:rPr>
-              <w:t>CREATE TABLE transactions (</w:t>
-              <w:br/>
-              <w:t xml:space="preserve">  id INTEGER PRIMARY KEY AUTOINCREMENT,</w:t>
-              <w:br/>
-              <w:t xml:space="preserve">  title TEXT NOT NULL,</w:t>
-              <w:br/>
-              <w:t xml:space="preserve">  amount REAL NOT NULL,</w:t>
-              <w:br/>
-              <w:t xml:space="preserve">  type TEXT NOT NULL,</w:t>
-              <w:br/>
-              <w:t xml:space="preserve">  category TEXT NOT NULL,</w:t>
-              <w:br/>
-              <w:t xml:space="preserve">  date TEXT NOT NULL,</w:t>
-              <w:br/>
-              <w:t xml:space="preserve">  note TEXT</w:t>
-              <w:br/>
-              <w:t>);</w:t>
-            </w:r>
-          </w:p>
-        </w:tc>
-      </w:tr>
-    </w:tbl>
-    <w:p>
-      <w:pPr>
-        <w:spacing w:after="80"/>
-      </w:pPr>
-    </w:p>
-    <w:p>
-      <w:r>
-        <w:t>Operasi CRUD dan Agregasi Asinkron: Seluruh operasi basis data dibungkus dalam class singleton DatabaseHelper (lib/services/database_helper.dart). Berikut potongan kode implementasi fungsi Create, Read, Agregasi Total, dan Delete:</w:t>
-      </w:r>
-    </w:p>
-    <w:tbl>
-      <w:tblPr>
-        <w:tblW w:type="auto" w:w="0"/>
-        <w:jc w:val="center"/>
-        <w:tblLook w:firstColumn="1" w:firstRow="1" w:lastColumn="0" w:lastRow="0" w:noHBand="0" w:noVBand="1" w:val="04A0"/>
-      </w:tblPr>
-      <w:tblGrid>
-        <w:gridCol w:w="7937"/>
-      </w:tblGrid>
-      <w:tr>
-        <w:tc>
-          <w:tcPr>
-            <w:tcW w:type="dxa" w:w="7937"/>
-            <w:shd w:val="clear" w:color="auto" w:fill="F1F5F9"/>
-            <w:tcMar>
-              <w:top w:w="140" w:type="dxa"/>
-              <w:bottom w:w="140" w:type="dxa"/>
-              <w:left w:w="200" w:type="dxa"/>
-              <w:right w:w="200" w:type="dxa"/>
-            </w:tcMar>
-            <w:tcBorders>
-              <w:top w:val="single" w:sz="4" w:space="0" w:color="CBD5E1"/>
-              <w:left w:val="single" w:sz="4" w:space="0" w:color="CBD5E1"/>
-              <w:bottom w:val="single" w:sz="4" w:space="0" w:color="CBD5E1"/>
-              <w:right w:val="single" w:sz="4" w:space="0" w:color="CBD5E1"/>
-            </w:tcBorders>
-          </w:tcPr>
-          <w:p>
-            <w:pPr>
-              <w:spacing w:line="276" w:lineRule="auto" w:after="40" w:before="40"/>
-              <w:jc w:val="left"/>
-            </w:pPr>
-            <w:r>
-              <w:rPr>
-                <w:rFonts w:ascii="Consolas" w:hAnsi="Consolas"/>
-                <w:color w:val="1E293B"/>
-                <w:sz w:val="19"/>
-              </w:rPr>
-              <w:t>// 1. CREATE: Menambahkan transaksi baru ke SQLite</w:t>
-              <w:br/>
-              <w:t>Future&lt;int&gt; insertTransaction(TransactionModel transaction) async {</w:t>
-              <w:br/>
-              <w:t xml:space="preserve">  final db = await database; // Menunggu koneksi database terbuka secara async</w:t>
-              <w:br/>
-              <w:t xml:space="preserve">  return await db.insert('transactions', transaction.toMap());</w:t>
-              <w:br/>
-              <w:t>}</w:t>
-              <w:br/>
-              <w:br/>
-              <w:t>// 2. READ: Mengambil daftar transaksi dengan proteksi SQL Injection</w:t>
-              <w:br/>
-              <w:t>Future&lt;List&lt;TransactionModel&gt;&gt; getAllTransactions({String? filterType, String? searchKeyword}) async {</w:t>
-              <w:br/>
-              <w:t xml:space="preserve">  final db = await database;</w:t>
-              <w:br/>
-              <w:t xml:space="preserve">  List&lt;String&gt; conditions = [];</w:t>
-              <w:br/>
-              <w:t xml:space="preserve">  List&lt;dynamic&gt; whereArgs = [];</w:t>
-              <w:br/>
-              <w:br/>
-              <w:t xml:space="preserve">  if (filterType != null &amp;&amp; filterType != 'all') {</w:t>
-              <w:br/>
-              <w:t xml:space="preserve">    conditions.add('type = ?');</w:t>
-              <w:br/>
-              <w:t xml:space="preserve">    whereArgs.add(filterType);</w:t>
-              <w:br/>
-              <w:t xml:space="preserve">  }</w:t>
-              <w:br/>
-              <w:t xml:space="preserve">  if (searchKeyword != null &amp;&amp; searchKeyword.trim().isNotEmpty) {</w:t>
-              <w:br/>
-              <w:t xml:space="preserve">    conditions.add('(title LIKE ? OR category LIKE ? OR note LIKE ?)');</w:t>
-              <w:br/>
-              <w:t xml:space="preserve">    final term = '%${searchKeyword.trim()}%';</w:t>
-              <w:br/>
-              <w:t xml:space="preserve">    whereArgs.addAll([term, term, term]);</w:t>
-              <w:br/>
-              <w:t xml:space="preserve">  }</w:t>
-              <w:br/>
-              <w:br/>
-              <w:t xml:space="preserve">  final result = await db.query(</w:t>
-              <w:br/>
-              <w:t xml:space="preserve">    'transactions',</w:t>
-              <w:br/>
-              <w:t xml:space="preserve">    where: conditions.isNotEmpty ? conditions.join(' AND ') : null,</w:t>
-              <w:br/>
-              <w:t xml:space="preserve">    whereArgs: whereArgs.isNotEmpty ? whereArgs : null,</w:t>
-              <w:br/>
-              <w:t xml:space="preserve">    orderBy: 'date DESC, id DESC',</w:t>
-              <w:br/>
-              <w:t xml:space="preserve">  );</w:t>
-              <w:br/>
-              <w:t xml:space="preserve">  return result.map((json) =&gt; TransactionModel.fromMap(json)).toList();</w:t>
-              <w:br/>
-              <w:t>}</w:t>
-              <w:br/>
-              <w:br/>
-              <w:t>// 3. READ AGGREGATE: Menghitung total saldo, pemasukan, dan pengeluaran secara matematis di SQL</w:t>
-              <w:br/>
-              <w:t>Future&lt;Map&lt;String, double&gt;&gt; getSummaryTotals() async {</w:t>
-              <w:br/>
-              <w:t xml:space="preserve">  final db = await database;</w:t>
-              <w:br/>
-              <w:t xml:space="preserve">  final incomeResult = await db.rawQuery("SELECT SUM(amount) as total FROM transactions WHERE type = 'income'");</w:t>
-              <w:br/>
-              <w:t xml:space="preserve">  final expenseResult = await db.rawQuery("SELECT SUM(amount) as total FROM transactions WHERE type = 'expense'");</w:t>
-              <w:br/>
-              <w:br/>
-              <w:t xml:space="preserve">  final double income = (incomeResult.first['total'] as num?)?.toDouble() ?? 0.0;</w:t>
-              <w:br/>
-              <w:t xml:space="preserve">  final double expense = (expenseResult.first['total'] as num?)?.toDouble() ?? 0.0;</w:t>
-              <w:br/>
-              <w:t xml:space="preserve">  return {'income': income, 'expense': expense, 'balance': income - expense};</w:t>
-              <w:br/>
-              <w:t>}</w:t>
-              <w:br/>
-              <w:br/>
-              <w:t>// 4. DELETE: Menghapus catatan berdasarkan Primary Key</w:t>
-              <w:br/>
-              <w:t>Future&lt;int&gt; deleteTransaction(int id) async {</w:t>
-              <w:br/>
-              <w:t xml:space="preserve">  final db = await database;</w:t>
-              <w:br/>
-              <w:t xml:space="preserve">  return await db.delete('transactions', where: 'id = ?', whereArgs: [id]);</w:t>
-              <w:br/>
-              <w:t>}</w:t>
-            </w:r>
-          </w:p>
-        </w:tc>
-      </w:tr>
-    </w:tbl>
-    <w:p>
-      <w:pPr>
-        <w:spacing w:after="80"/>
-      </w:pPr>
-    </w:p>
-    <w:p>
-      <w:pPr>
-        <w:spacing w:before="280" w:after="120"/>
-      </w:pPr>
-      <w:r>
-        <w:rPr>
-          <w:b/>
-          <w:sz w:val="24"/>
-        </w:rPr>
-        <w:t>2.5. Pengujian dan Hasil Implementasi</w:t>
-      </w:r>
-    </w:p>
-    <w:p>
-      <w:r>
-        <w:t>Pengujian perangkat lunak dilakukan secara komprehensif menggunakan automated test suite (flutter test) dan pengujian fungsional interaktif untuk memastikan setiap modul berjalan sesuai dengan spesifikasi yang diharapkan. Rincian hasil pengujian disajikan pada tabel berikut (mengacu pada format instrumen pengujian UTS):</w:t>
-      </w:r>
-    </w:p>
-    <w:tbl>
-      <w:tblPr>
-        <w:tblW w:type="auto" w:w="0"/>
-        <w:jc w:val="center"/>
-        <w:tblLook w:firstColumn="1" w:firstRow="1" w:lastColumn="0" w:lastRow="0" w:noHBand="0" w:noVBand="1" w:val="04A0"/>
-      </w:tblPr>
-      <w:tblGrid>
-        <w:gridCol w:w="1587"/>
-        <w:gridCol w:w="1587"/>
-        <w:gridCol w:w="1587"/>
-        <w:gridCol w:w="1587"/>
-        <w:gridCol w:w="1587"/>
-      </w:tblGrid>
-      <w:tr>
-        <w:tc>
-          <w:tcPr>
-            <w:tcW w:type="dxa" w:w="1587"/>
-            <w:shd w:val="clear" w:color="auto" w:fill="E2E8F0"/>
-            <w:tcMar>
-              <w:top w:w="120" w:type="dxa"/>
-              <w:bottom w:w="120" w:type="dxa"/>
-              <w:left w:w="120" w:type="dxa"/>
-              <w:right w:w="120" w:type="dxa"/>
-            </w:tcMar>
-          </w:tcPr>
-          <w:p>
-            <w:pPr>
-              <w:jc w:val="center"/>
-            </w:pPr>
-            <w:r>
-              <w:rPr>
-                <w:b/>
-              </w:rPr>
-              <w:t>No.</w:t>
+              <w:t>No</w:t>
             </w:r>
           </w:p>
         </w:tc>
         <w:tc>
           <w:tcPr>
-            <w:tcW w:type="dxa" w:w="1587"/>
-            <w:shd w:val="clear" w:color="auto" w:fill="E2E8F0"/>
-            <w:tcMar>
-              <w:top w:w="120" w:type="dxa"/>
-              <w:bottom w:w="120" w:type="dxa"/>
-              <w:left w:w="120" w:type="dxa"/>
-              <w:right w:w="120" w:type="dxa"/>
-            </w:tcMar>
+            <w:tcW w:type="dxa" w:w="1984"/>
+            <w:shd w:fill="D9EAF7"/>
           </w:tcPr>
           <w:p>
             <w:pPr>
-              <w:jc w:val="center"/>
+              <w:spacing w:after="0"/>
             </w:pPr>
+            <w:r/>
             <w:r>
               <w:rPr>
+                <w:rFonts w:ascii="Times New Roman" w:hAnsi="Times New Roman"/>
                 <w:b/>
+                <w:sz w:val="20"/>
               </w:rPr>
-              <w:t>Fitur yang Diuji</w:t>
+              <w:t>Skenario</w:t>
             </w:r>
           </w:p>
         </w:tc>
         <w:tc>
           <w:tcPr>
-            <w:tcW w:type="dxa" w:w="1587"/>
-            <w:shd w:val="clear" w:color="auto" w:fill="E2E8F0"/>
-            <w:tcMar>
-              <w:top w:w="120" w:type="dxa"/>
-              <w:bottom w:w="120" w:type="dxa"/>
-              <w:left w:w="120" w:type="dxa"/>
-              <w:right w:w="120" w:type="dxa"/>
-            </w:tcMar>
+            <w:tcW w:type="dxa" w:w="1984"/>
+            <w:shd w:fill="D9EAF7"/>
           </w:tcPr>
           <w:p>
             <w:pPr>
-              <w:jc w:val="center"/>
+              <w:spacing w:after="0"/>
             </w:pPr>
+            <w:r/>
             <w:r>
               <w:rPr>
+                <w:rFonts w:ascii="Times New Roman" w:hAnsi="Times New Roman"/>
                 <w:b/>
-              </w:rPr>
-              <w:t>Langkah Pengujian</w:t>
-            </w:r>
-          </w:p>
-        </w:tc>
-        <w:tc>
-          <w:tcPr>
-            <w:tcW w:type="dxa" w:w="1587"/>
-            <w:shd w:val="clear" w:color="auto" w:fill="E2E8F0"/>
-            <w:tcMar>
-              <w:top w:w="120" w:type="dxa"/>
-              <w:bottom w:w="120" w:type="dxa"/>
-              <w:left w:w="120" w:type="dxa"/>
-              <w:right w:w="120" w:type="dxa"/>
-            </w:tcMar>
-          </w:tcPr>
-          <w:p>
-            <w:pPr>
-              <w:jc w:val="center"/>
-            </w:pPr>
-            <w:r>
-              <w:rPr>
-                <w:b/>
+                <w:sz w:val="20"/>
               </w:rPr>
               <w:t>Hasil yang Diharapkan</w:t>
             </w:r>
@@ -1868,24 +1576,21 @@
         </w:tc>
         <w:tc>
           <w:tcPr>
-            <w:tcW w:type="dxa" w:w="1587"/>
-            <w:shd w:val="clear" w:color="auto" w:fill="E2E8F0"/>
-            <w:tcMar>
-              <w:top w:w="120" w:type="dxa"/>
-              <w:bottom w:w="120" w:type="dxa"/>
-              <w:left w:w="120" w:type="dxa"/>
-              <w:right w:w="120" w:type="dxa"/>
-            </w:tcMar>
+            <w:tcW w:type="dxa" w:w="1984"/>
+            <w:shd w:fill="D9EAF7"/>
           </w:tcPr>
           <w:p>
             <w:pPr>
-              <w:jc w:val="center"/>
+              <w:spacing w:after="0"/>
             </w:pPr>
+            <w:r/>
             <w:r>
               <w:rPr>
+                <w:rFonts w:ascii="Times New Roman" w:hAnsi="Times New Roman"/>
                 <w:b/>
+                <w:sz w:val="20"/>
               </w:rPr>
-              <w:t>Hasil Pengujian</w:t>
+              <w:t>Hasil Aktual</w:t>
             </w:r>
           </w:p>
         </w:tc>
@@ -1893,100 +1598,75 @@
       <w:tr>
         <w:tc>
           <w:tcPr>
-            <w:tcW w:type="dxa" w:w="1587"/>
-            <w:tcMar>
-              <w:top w:w="80" w:type="dxa"/>
-              <w:bottom w:w="80" w:type="dxa"/>
-              <w:left w:w="100" w:type="dxa"/>
-              <w:right w:w="100" w:type="dxa"/>
-            </w:tcMar>
+            <w:tcW w:type="dxa" w:w="1984"/>
           </w:tcPr>
           <w:p>
             <w:pPr>
-              <w:spacing w:line="276" w:lineRule="auto" w:after="40"/>
-              <w:jc w:val="center"/>
+              <w:spacing w:after="0"/>
             </w:pPr>
+            <w:r/>
             <w:r>
+              <w:rPr>
+                <w:rFonts w:ascii="Times New Roman" w:hAnsi="Times New Roman"/>
+                <w:b w:val="0"/>
+                <w:sz w:val="20"/>
+              </w:rPr>
               <w:t>1</w:t>
             </w:r>
           </w:p>
         </w:tc>
         <w:tc>
           <w:tcPr>
-            <w:tcW w:type="dxa" w:w="1587"/>
-            <w:tcMar>
-              <w:top w:w="80" w:type="dxa"/>
-              <w:bottom w:w="80" w:type="dxa"/>
-              <w:left w:w="100" w:type="dxa"/>
-              <w:right w:w="100" w:type="dxa"/>
-            </w:tcMar>
+            <w:tcW w:type="dxa" w:w="1984"/>
           </w:tcPr>
           <w:p>
             <w:pPr>
-              <w:spacing w:line="276" w:lineRule="auto" w:after="40"/>
+              <w:spacing w:after="0"/>
             </w:pPr>
+            <w:r/>
             <w:r>
-              <w:t>Fitur utama aplikasi (CRUD Transaksi)</w:t>
+              <w:rPr>
+                <w:rFonts w:ascii="Times New Roman" w:hAnsi="Times New Roman"/>
+                <w:b w:val="0"/>
+                <w:sz w:val="20"/>
+              </w:rPr>
+              <w:t>Tambah transaksi</w:t>
             </w:r>
           </w:p>
         </w:tc>
         <w:tc>
           <w:tcPr>
-            <w:tcW w:type="dxa" w:w="1587"/>
-            <w:tcMar>
-              <w:top w:w="80" w:type="dxa"/>
-              <w:bottom w:w="80" w:type="dxa"/>
-              <w:left w:w="100" w:type="dxa"/>
-              <w:right w:w="100" w:type="dxa"/>
-            </w:tcMar>
+            <w:tcW w:type="dxa" w:w="1984"/>
           </w:tcPr>
           <w:p>
             <w:pPr>
-              <w:spacing w:line="276" w:lineRule="auto" w:after="40"/>
+              <w:spacing w:after="0"/>
             </w:pPr>
+            <w:r/>
             <w:r>
-              <w:t>Membuka form tambah transaksi, memasukkan nominal dan kategori, lalu menekan tombol Simpan.</w:t>
+              <w:rPr>
+                <w:rFonts w:ascii="Times New Roman" w:hAnsi="Times New Roman"/>
+                <w:b w:val="0"/>
+                <w:sz w:val="20"/>
+              </w:rPr>
+              <w:t>Data masuk SQLite dan muncul di dashboard</w:t>
             </w:r>
           </w:p>
         </w:tc>
         <w:tc>
           <w:tcPr>
-            <w:tcW w:type="dxa" w:w="1587"/>
-            <w:tcMar>
-              <w:top w:w="80" w:type="dxa"/>
-              <w:bottom w:w="80" w:type="dxa"/>
-              <w:left w:w="100" w:type="dxa"/>
-              <w:right w:w="100" w:type="dxa"/>
-            </w:tcMar>
+            <w:tcW w:type="dxa" w:w="1984"/>
           </w:tcPr>
           <w:p>
             <w:pPr>
-              <w:spacing w:line="276" w:lineRule="auto" w:after="40"/>
+              <w:spacing w:after="0"/>
             </w:pPr>
-            <w:r>
-              <w:t>Data transaksi baru berhasil dimasukkan ke tabel SQLite dan langsung muncul di daftar riwayat beranda.</w:t>
-            </w:r>
-          </w:p>
-        </w:tc>
-        <w:tc>
-          <w:tcPr>
-            <w:tcW w:type="dxa" w:w="1587"/>
-            <w:tcMar>
-              <w:top w:w="80" w:type="dxa"/>
-              <w:bottom w:w="80" w:type="dxa"/>
-              <w:left w:w="100" w:type="dxa"/>
-              <w:right w:w="100" w:type="dxa"/>
-            </w:tcMar>
-          </w:tcPr>
-          <w:p>
-            <w:pPr>
-              <w:spacing w:line="276" w:lineRule="auto" w:after="40"/>
-              <w:jc w:val="center"/>
-            </w:pPr>
+            <w:r/>
             <w:r>
               <w:rPr>
-                <w:b/>
-                <w:color w:val="10B981"/>
+                <w:rFonts w:ascii="Times New Roman" w:hAnsi="Times New Roman"/>
+                <w:b w:val="0"/>
+                <w:sz w:val="20"/>
               </w:rPr>
               <w:t>Berhasil</w:t>
             </w:r>
@@ -1996,100 +1676,75 @@
       <w:tr>
         <w:tc>
           <w:tcPr>
-            <w:tcW w:type="dxa" w:w="1587"/>
-            <w:tcMar>
-              <w:top w:w="80" w:type="dxa"/>
-              <w:bottom w:w="80" w:type="dxa"/>
-              <w:left w:w="100" w:type="dxa"/>
-              <w:right w:w="100" w:type="dxa"/>
-            </w:tcMar>
+            <w:tcW w:type="dxa" w:w="1984"/>
           </w:tcPr>
           <w:p>
             <w:pPr>
-              <w:spacing w:line="276" w:lineRule="auto" w:after="40"/>
-              <w:jc w:val="center"/>
+              <w:spacing w:after="0"/>
             </w:pPr>
+            <w:r/>
             <w:r>
+              <w:rPr>
+                <w:rFonts w:ascii="Times New Roman" w:hAnsi="Times New Roman"/>
+                <w:b w:val="0"/>
+                <w:sz w:val="20"/>
+              </w:rPr>
               <w:t>2</w:t>
             </w:r>
           </w:p>
         </w:tc>
         <w:tc>
           <w:tcPr>
-            <w:tcW w:type="dxa" w:w="1587"/>
-            <w:tcMar>
-              <w:top w:w="80" w:type="dxa"/>
-              <w:bottom w:w="80" w:type="dxa"/>
-              <w:left w:w="100" w:type="dxa"/>
-              <w:right w:w="100" w:type="dxa"/>
-            </w:tcMar>
+            <w:tcW w:type="dxa" w:w="1984"/>
           </w:tcPr>
           <w:p>
             <w:pPr>
-              <w:spacing w:line="276" w:lineRule="auto" w:after="40"/>
+              <w:spacing w:after="0"/>
             </w:pPr>
+            <w:r/>
             <w:r>
-              <w:t>Proses asinkron (Future, async, await)</w:t>
+              <w:rPr>
+                <w:rFonts w:ascii="Times New Roman" w:hAnsi="Times New Roman"/>
+                <w:b w:val="0"/>
+                <w:sz w:val="20"/>
+              </w:rPr>
+              <w:t>Edit transaksi</w:t>
             </w:r>
           </w:p>
         </w:tc>
         <w:tc>
           <w:tcPr>
-            <w:tcW w:type="dxa" w:w="1587"/>
-            <w:tcMar>
-              <w:top w:w="80" w:type="dxa"/>
-              <w:bottom w:w="80" w:type="dxa"/>
-              <w:left w:w="100" w:type="dxa"/>
-              <w:right w:w="100" w:type="dxa"/>
-            </w:tcMar>
+            <w:tcW w:type="dxa" w:w="1984"/>
           </w:tcPr>
           <w:p>
             <w:pPr>
-              <w:spacing w:line="276" w:lineRule="auto" w:after="40"/>
+              <w:spacing w:after="0"/>
             </w:pPr>
+            <w:r/>
             <w:r>
-              <w:t>Menjalankan pemanggilan data SQLite, SharedPreferences, dan quote tips melalui Future.wait.</w:t>
+              <w:rPr>
+                <w:rFonts w:ascii="Times New Roman" w:hAnsi="Times New Roman"/>
+                <w:b w:val="0"/>
+                <w:sz w:val="20"/>
+              </w:rPr>
+              <w:t>Data berubah berdasarkan id</w:t>
             </w:r>
           </w:p>
         </w:tc>
         <w:tc>
           <w:tcPr>
-            <w:tcW w:type="dxa" w:w="1587"/>
-            <w:tcMar>
-              <w:top w:w="80" w:type="dxa"/>
-              <w:bottom w:w="80" w:type="dxa"/>
-              <w:left w:w="100" w:type="dxa"/>
-              <w:right w:w="100" w:type="dxa"/>
-            </w:tcMar>
+            <w:tcW w:type="dxa" w:w="1984"/>
           </w:tcPr>
           <w:p>
             <w:pPr>
-              <w:spacing w:line="276" w:lineRule="auto" w:after="40"/>
+              <w:spacing w:after="0"/>
             </w:pPr>
-            <w:r>
-              <w:t>Proses berjalan non-blocking di latar belakang tanpa freezing, indikator loading tampil saat memuat data.</w:t>
-            </w:r>
-          </w:p>
-        </w:tc>
-        <w:tc>
-          <w:tcPr>
-            <w:tcW w:type="dxa" w:w="1587"/>
-            <w:tcMar>
-              <w:top w:w="80" w:type="dxa"/>
-              <w:bottom w:w="80" w:type="dxa"/>
-              <w:left w:w="100" w:type="dxa"/>
-              <w:right w:w="100" w:type="dxa"/>
-            </w:tcMar>
-          </w:tcPr>
-          <w:p>
-            <w:pPr>
-              <w:spacing w:line="276" w:lineRule="auto" w:after="40"/>
-              <w:jc w:val="center"/>
-            </w:pPr>
+            <w:r/>
             <w:r>
               <w:rPr>
-                <w:b/>
-                <w:color w:val="10B981"/>
+                <w:rFonts w:ascii="Times New Roman" w:hAnsi="Times New Roman"/>
+                <w:b w:val="0"/>
+                <w:sz w:val="20"/>
               </w:rPr>
               <w:t>Berhasil</w:t>
             </w:r>
@@ -2099,100 +1754,75 @@
       <w:tr>
         <w:tc>
           <w:tcPr>
-            <w:tcW w:type="dxa" w:w="1587"/>
-            <w:tcMar>
-              <w:top w:w="80" w:type="dxa"/>
-              <w:bottom w:w="80" w:type="dxa"/>
-              <w:left w:w="100" w:type="dxa"/>
-              <w:right w:w="100" w:type="dxa"/>
-            </w:tcMar>
+            <w:tcW w:type="dxa" w:w="1984"/>
           </w:tcPr>
           <w:p>
             <w:pPr>
-              <w:spacing w:line="276" w:lineRule="auto" w:after="40"/>
-              <w:jc w:val="center"/>
+              <w:spacing w:after="0"/>
             </w:pPr>
+            <w:r/>
             <w:r>
+              <w:rPr>
+                <w:rFonts w:ascii="Times New Roman" w:hAnsi="Times New Roman"/>
+                <w:b w:val="0"/>
+                <w:sz w:val="20"/>
+              </w:rPr>
               <w:t>3</w:t>
             </w:r>
           </w:p>
         </w:tc>
         <w:tc>
           <w:tcPr>
-            <w:tcW w:type="dxa" w:w="1587"/>
-            <w:tcMar>
-              <w:top w:w="80" w:type="dxa"/>
-              <w:bottom w:w="80" w:type="dxa"/>
-              <w:left w:w="100" w:type="dxa"/>
-              <w:right w:w="100" w:type="dxa"/>
-            </w:tcMar>
+            <w:tcW w:type="dxa" w:w="1984"/>
           </w:tcPr>
           <w:p>
             <w:pPr>
-              <w:spacing w:line="276" w:lineRule="auto" w:after="40"/>
+              <w:spacing w:after="0"/>
             </w:pPr>
+            <w:r/>
             <w:r>
-              <w:t>Penyimpanan data pertama (SharedPreferences)</w:t>
+              <w:rPr>
+                <w:rFonts w:ascii="Times New Roman" w:hAnsi="Times New Roman"/>
+                <w:b w:val="0"/>
+                <w:sz w:val="20"/>
+              </w:rPr>
+              <w:t>Hapus transaksi</w:t>
             </w:r>
           </w:p>
         </w:tc>
         <w:tc>
           <w:tcPr>
-            <w:tcW w:type="dxa" w:w="1587"/>
-            <w:tcMar>
-              <w:top w:w="80" w:type="dxa"/>
-              <w:bottom w:w="80" w:type="dxa"/>
-              <w:left w:w="100" w:type="dxa"/>
-              <w:right w:w="100" w:type="dxa"/>
-            </w:tcMar>
+            <w:tcW w:type="dxa" w:w="1984"/>
           </w:tcPr>
           <w:p>
             <w:pPr>
-              <w:spacing w:line="276" w:lineRule="auto" w:after="40"/>
+              <w:spacing w:after="0"/>
             </w:pPr>
+            <w:r/>
             <w:r>
-              <w:t>Mengubah status switch tema ke Dark Mode dan mengubah nama pengguna di halaman pengaturan.</w:t>
+              <w:rPr>
+                <w:rFonts w:ascii="Times New Roman" w:hAnsi="Times New Roman"/>
+                <w:b w:val="0"/>
+                <w:sz w:val="20"/>
+              </w:rPr>
+              <w:t>Data terhapus dan dashboard refresh</w:t>
             </w:r>
           </w:p>
         </w:tc>
         <w:tc>
           <w:tcPr>
-            <w:tcW w:type="dxa" w:w="1587"/>
-            <w:tcMar>
-              <w:top w:w="80" w:type="dxa"/>
-              <w:bottom w:w="80" w:type="dxa"/>
-              <w:left w:w="100" w:type="dxa"/>
-              <w:right w:w="100" w:type="dxa"/>
-            </w:tcMar>
+            <w:tcW w:type="dxa" w:w="1984"/>
           </w:tcPr>
           <w:p>
             <w:pPr>
-              <w:spacing w:line="276" w:lineRule="auto" w:after="40"/>
+              <w:spacing w:after="0"/>
             </w:pPr>
-            <w:r>
-              <w:t>Preferensi tema dan nama profil berhasil tersimpan dalam pasangan key-value lokal.</w:t>
-            </w:r>
-          </w:p>
-        </w:tc>
-        <w:tc>
-          <w:tcPr>
-            <w:tcW w:type="dxa" w:w="1587"/>
-            <w:tcMar>
-              <w:top w:w="80" w:type="dxa"/>
-              <w:bottom w:w="80" w:type="dxa"/>
-              <w:left w:w="100" w:type="dxa"/>
-              <w:right w:w="100" w:type="dxa"/>
-            </w:tcMar>
-          </w:tcPr>
-          <w:p>
-            <w:pPr>
-              <w:spacing w:line="276" w:lineRule="auto" w:after="40"/>
-              <w:jc w:val="center"/>
-            </w:pPr>
+            <w:r/>
             <w:r>
               <w:rPr>
-                <w:b/>
-                <w:color w:val="10B981"/>
+                <w:rFonts w:ascii="Times New Roman" w:hAnsi="Times New Roman"/>
+                <w:b w:val="0"/>
+                <w:sz w:val="20"/>
               </w:rPr>
               <w:t>Berhasil</w:t>
             </w:r>
@@ -2202,100 +1832,75 @@
       <w:tr>
         <w:tc>
           <w:tcPr>
-            <w:tcW w:type="dxa" w:w="1587"/>
-            <w:tcMar>
-              <w:top w:w="80" w:type="dxa"/>
-              <w:bottom w:w="80" w:type="dxa"/>
-              <w:left w:w="100" w:type="dxa"/>
-              <w:right w:w="100" w:type="dxa"/>
-            </w:tcMar>
+            <w:tcW w:type="dxa" w:w="1984"/>
           </w:tcPr>
           <w:p>
             <w:pPr>
-              <w:spacing w:line="276" w:lineRule="auto" w:after="40"/>
-              <w:jc w:val="center"/>
+              <w:spacing w:after="0"/>
             </w:pPr>
+            <w:r/>
             <w:r>
+              <w:rPr>
+                <w:rFonts w:ascii="Times New Roman" w:hAnsi="Times New Roman"/>
+                <w:b w:val="0"/>
+                <w:sz w:val="20"/>
+              </w:rPr>
               <w:t>4</w:t>
             </w:r>
           </w:p>
         </w:tc>
         <w:tc>
           <w:tcPr>
-            <w:tcW w:type="dxa" w:w="1587"/>
-            <w:tcMar>
-              <w:top w:w="80" w:type="dxa"/>
-              <w:bottom w:w="80" w:type="dxa"/>
-              <w:left w:w="100" w:type="dxa"/>
-              <w:right w:w="100" w:type="dxa"/>
-            </w:tcMar>
+            <w:tcW w:type="dxa" w:w="1984"/>
           </w:tcPr>
           <w:p>
             <w:pPr>
-              <w:spacing w:line="276" w:lineRule="auto" w:after="40"/>
+              <w:spacing w:after="0"/>
             </w:pPr>
+            <w:r/>
             <w:r>
-              <w:t>Penyimpanan data kedua (SQLite)</w:t>
+              <w:rPr>
+                <w:rFonts w:ascii="Times New Roman" w:hAnsi="Times New Roman"/>
+                <w:b w:val="0"/>
+                <w:sz w:val="20"/>
+              </w:rPr>
+              <w:t>Pencarian/filter</w:t>
             </w:r>
           </w:p>
         </w:tc>
         <w:tc>
           <w:tcPr>
-            <w:tcW w:type="dxa" w:w="1587"/>
-            <w:tcMar>
-              <w:top w:w="80" w:type="dxa"/>
-              <w:bottom w:w="80" w:type="dxa"/>
-              <w:left w:w="100" w:type="dxa"/>
-              <w:right w:w="100" w:type="dxa"/>
-            </w:tcMar>
+            <w:tcW w:type="dxa" w:w="1984"/>
           </w:tcPr>
           <w:p>
             <w:pPr>
-              <w:spacing w:line="276" w:lineRule="auto" w:after="40"/>
+              <w:spacing w:after="0"/>
             </w:pPr>
+            <w:r/>
             <w:r>
-              <w:t>Menyimpan beberapa transaksi pengeluaran dan pemasukan, kemudian melihat ringkasan saldo.</w:t>
+              <w:rPr>
+                <w:rFonts w:ascii="Times New Roman" w:hAnsi="Times New Roman"/>
+                <w:b w:val="0"/>
+                <w:sz w:val="20"/>
+              </w:rPr>
+              <w:t>Daftar sesuai keyword dan tipe</w:t>
             </w:r>
           </w:p>
         </w:tc>
         <w:tc>
           <w:tcPr>
-            <w:tcW w:type="dxa" w:w="1587"/>
-            <w:tcMar>
-              <w:top w:w="80" w:type="dxa"/>
-              <w:bottom w:w="80" w:type="dxa"/>
-              <w:left w:w="100" w:type="dxa"/>
-              <w:right w:w="100" w:type="dxa"/>
-            </w:tcMar>
+            <w:tcW w:type="dxa" w:w="1984"/>
           </w:tcPr>
           <w:p>
             <w:pPr>
-              <w:spacing w:line="276" w:lineRule="auto" w:after="40"/>
+              <w:spacing w:after="0"/>
             </w:pPr>
-            <w:r>
-              <w:t>Data tersimpan terstruktur dalam tabel transactions, nilai agregat SUM dihitung dengan akurat.</w:t>
-            </w:r>
-          </w:p>
-        </w:tc>
-        <w:tc>
-          <w:tcPr>
-            <w:tcW w:type="dxa" w:w="1587"/>
-            <w:tcMar>
-              <w:top w:w="80" w:type="dxa"/>
-              <w:bottom w:w="80" w:type="dxa"/>
-              <w:left w:w="100" w:type="dxa"/>
-              <w:right w:w="100" w:type="dxa"/>
-            </w:tcMar>
-          </w:tcPr>
-          <w:p>
-            <w:pPr>
-              <w:spacing w:line="276" w:lineRule="auto" w:after="40"/>
-              <w:jc w:val="center"/>
-            </w:pPr>
+            <w:r/>
             <w:r>
               <w:rPr>
-                <w:b/>
-                <w:color w:val="10B981"/>
+                <w:rFonts w:ascii="Times New Roman" w:hAnsi="Times New Roman"/>
+                <w:b w:val="0"/>
+                <w:sz w:val="20"/>
               </w:rPr>
               <w:t>Berhasil</w:t>
             </w:r>
@@ -2305,100 +1910,75 @@
       <w:tr>
         <w:tc>
           <w:tcPr>
-            <w:tcW w:type="dxa" w:w="1587"/>
-            <w:tcMar>
-              <w:top w:w="80" w:type="dxa"/>
-              <w:bottom w:w="80" w:type="dxa"/>
-              <w:left w:w="100" w:type="dxa"/>
-              <w:right w:w="100" w:type="dxa"/>
-            </w:tcMar>
+            <w:tcW w:type="dxa" w:w="1984"/>
           </w:tcPr>
           <w:p>
             <w:pPr>
-              <w:spacing w:line="276" w:lineRule="auto" w:after="40"/>
-              <w:jc w:val="center"/>
+              <w:spacing w:after="0"/>
             </w:pPr>
+            <w:r/>
             <w:r>
+              <w:rPr>
+                <w:rFonts w:ascii="Times New Roman" w:hAnsi="Times New Roman"/>
+                <w:b w:val="0"/>
+                <w:sz w:val="20"/>
+              </w:rPr>
               <w:t>5</w:t>
             </w:r>
           </w:p>
         </w:tc>
         <w:tc>
           <w:tcPr>
-            <w:tcW w:type="dxa" w:w="1587"/>
-            <w:tcMar>
-              <w:top w:w="80" w:type="dxa"/>
-              <w:bottom w:w="80" w:type="dxa"/>
-              <w:left w:w="100" w:type="dxa"/>
-              <w:right w:w="100" w:type="dxa"/>
-            </w:tcMar>
+            <w:tcW w:type="dxa" w:w="1984"/>
           </w:tcPr>
           <w:p>
             <w:pPr>
-              <w:spacing w:line="276" w:lineRule="auto" w:after="40"/>
+              <w:spacing w:after="0"/>
             </w:pPr>
+            <w:r/>
             <w:r>
-              <w:t>Persistensi data (Offline &amp; Reboot)</w:t>
+              <w:rPr>
+                <w:rFonts w:ascii="Times New Roman" w:hAnsi="Times New Roman"/>
+                <w:b w:val="0"/>
+                <w:sz w:val="20"/>
+              </w:rPr>
+              <w:t>Statistik kategori</w:t>
             </w:r>
           </w:p>
         </w:tc>
         <w:tc>
           <w:tcPr>
-            <w:tcW w:type="dxa" w:w="1587"/>
-            <w:tcMar>
-              <w:top w:w="80" w:type="dxa"/>
-              <w:bottom w:w="80" w:type="dxa"/>
-              <w:left w:w="100" w:type="dxa"/>
-              <w:right w:w="100" w:type="dxa"/>
-            </w:tcMar>
+            <w:tcW w:type="dxa" w:w="1984"/>
           </w:tcPr>
           <w:p>
             <w:pPr>
-              <w:spacing w:line="276" w:lineRule="auto" w:after="40"/>
+              <w:spacing w:after="0"/>
             </w:pPr>
+            <w:r/>
             <w:r>
-              <w:t>Menutup paksa aplikasi (terminate/kill process), memutuskan jaringan internet, lalu membuka kembali aplikasi.</w:t>
+              <w:rPr>
+                <w:rFonts w:ascii="Times New Roman" w:hAnsi="Times New Roman"/>
+                <w:b w:val="0"/>
+                <w:sz w:val="20"/>
+              </w:rPr>
+              <w:t>Agregasi GROUP BY tampil benar</w:t>
             </w:r>
           </w:p>
         </w:tc>
         <w:tc>
           <w:tcPr>
-            <w:tcW w:type="dxa" w:w="1587"/>
-            <w:tcMar>
-              <w:top w:w="80" w:type="dxa"/>
-              <w:bottom w:w="80" w:type="dxa"/>
-              <w:left w:w="100" w:type="dxa"/>
-              <w:right w:w="100" w:type="dxa"/>
-            </w:tcMar>
+            <w:tcW w:type="dxa" w:w="1984"/>
           </w:tcPr>
           <w:p>
             <w:pPr>
-              <w:spacing w:line="276" w:lineRule="auto" w:after="40"/>
+              <w:spacing w:after="0"/>
             </w:pPr>
-            <w:r>
-              <w:t>Seluruh catatan transaksi SQLite dan tema Dark Mode SharedPreferences tetap utuh dan tidak hilang.</w:t>
-            </w:r>
-          </w:p>
-        </w:tc>
-        <w:tc>
-          <w:tcPr>
-            <w:tcW w:type="dxa" w:w="1587"/>
-            <w:tcMar>
-              <w:top w:w="80" w:type="dxa"/>
-              <w:bottom w:w="80" w:type="dxa"/>
-              <w:left w:w="100" w:type="dxa"/>
-              <w:right w:w="100" w:type="dxa"/>
-            </w:tcMar>
-          </w:tcPr>
-          <w:p>
-            <w:pPr>
-              <w:spacing w:line="276" w:lineRule="auto" w:after="40"/>
-              <w:jc w:val="center"/>
-            </w:pPr>
+            <w:r/>
             <w:r>
               <w:rPr>
-                <w:b/>
-                <w:color w:val="10B981"/>
+                <w:rFonts w:ascii="Times New Roman" w:hAnsi="Times New Roman"/>
+                <w:b w:val="0"/>
+                <w:sz w:val="20"/>
               </w:rPr>
               <w:t>Berhasil</w:t>
             </w:r>
@@ -2408,100 +1988,309 @@
       <w:tr>
         <w:tc>
           <w:tcPr>
-            <w:tcW w:type="dxa" w:w="1587"/>
-            <w:tcMar>
-              <w:top w:w="80" w:type="dxa"/>
-              <w:bottom w:w="80" w:type="dxa"/>
-              <w:left w:w="100" w:type="dxa"/>
-              <w:right w:w="100" w:type="dxa"/>
-            </w:tcMar>
+            <w:tcW w:type="dxa" w:w="1984"/>
           </w:tcPr>
           <w:p>
             <w:pPr>
-              <w:spacing w:line="276" w:lineRule="auto" w:after="40"/>
-              <w:jc w:val="center"/>
+              <w:spacing w:after="0"/>
             </w:pPr>
+            <w:r/>
             <w:r>
+              <w:rPr>
+                <w:rFonts w:ascii="Times New Roman" w:hAnsi="Times New Roman"/>
+                <w:b w:val="0"/>
+                <w:sz w:val="20"/>
+              </w:rPr>
               <w:t>6</w:t>
             </w:r>
           </w:p>
         </w:tc>
         <w:tc>
           <w:tcPr>
-            <w:tcW w:type="dxa" w:w="1587"/>
-            <w:tcMar>
-              <w:top w:w="80" w:type="dxa"/>
-              <w:bottom w:w="80" w:type="dxa"/>
-              <w:left w:w="100" w:type="dxa"/>
-              <w:right w:w="100" w:type="dxa"/>
-            </w:tcMar>
+            <w:tcW w:type="dxa" w:w="1984"/>
           </w:tcPr>
           <w:p>
             <w:pPr>
-              <w:spacing w:line="276" w:lineRule="auto" w:after="40"/>
+              <w:spacing w:after="0"/>
             </w:pPr>
+            <w:r/>
             <w:r>
-              <w:t>Visualisasi Statistik Kategori</w:t>
+              <w:rPr>
+                <w:rFonts w:ascii="Times New Roman" w:hAnsi="Times New Roman"/>
+                <w:b w:val="0"/>
+                <w:sz w:val="20"/>
+              </w:rPr>
+              <w:t>Dark mode/nama/anggaran</w:t>
             </w:r>
           </w:p>
         </w:tc>
         <w:tc>
           <w:tcPr>
-            <w:tcW w:type="dxa" w:w="1587"/>
-            <w:tcMar>
-              <w:top w:w="80" w:type="dxa"/>
-              <w:bottom w:w="80" w:type="dxa"/>
-              <w:left w:w="100" w:type="dxa"/>
-              <w:right w:w="100" w:type="dxa"/>
-            </w:tcMar>
+            <w:tcW w:type="dxa" w:w="1984"/>
           </w:tcPr>
           <w:p>
             <w:pPr>
-              <w:spacing w:line="276" w:lineRule="auto" w:after="40"/>
+              <w:spacing w:after="0"/>
             </w:pPr>
+            <w:r/>
             <w:r>
-              <w:t>Membuka halaman statistik kategori dari tombol AppBar beranda.</w:t>
+              <w:rPr>
+                <w:rFonts w:ascii="Times New Roman" w:hAnsi="Times New Roman"/>
+                <w:b w:val="0"/>
+                <w:sz w:val="20"/>
+              </w:rPr>
+              <w:t>Preferensi tetap tersimpan</w:t>
             </w:r>
           </w:p>
         </w:tc>
         <w:tc>
           <w:tcPr>
-            <w:tcW w:type="dxa" w:w="1587"/>
-            <w:tcMar>
-              <w:top w:w="80" w:type="dxa"/>
-              <w:bottom w:w="80" w:type="dxa"/>
-              <w:left w:w="100" w:type="dxa"/>
-              <w:right w:w="100" w:type="dxa"/>
-            </w:tcMar>
+            <w:tcW w:type="dxa" w:w="1984"/>
           </w:tcPr>
           <w:p>
             <w:pPr>
-              <w:spacing w:line="276" w:lineRule="auto" w:after="40"/>
+              <w:spacing w:after="0"/>
             </w:pPr>
+            <w:r/>
             <w:r>
-              <w:t>Proporsi pengeluaran per kategori dikelompokkan (GROUP BY) dan ditampilkan dalam bentuk bar persentase.</w:t>
+              <w:rPr>
+                <w:rFonts w:ascii="Times New Roman" w:hAnsi="Times New Roman"/>
+                <w:b w:val="0"/>
+                <w:sz w:val="20"/>
+              </w:rPr>
+              <w:t>Berhasil</w:t>
+            </w:r>
+          </w:p>
+        </w:tc>
+      </w:tr>
+      <w:tr>
+        <w:tc>
+          <w:tcPr>
+            <w:tcW w:type="dxa" w:w="1984"/>
+          </w:tcPr>
+          <w:p>
+            <w:pPr>
+              <w:spacing w:after="0"/>
+            </w:pPr>
+            <w:r/>
+            <w:r>
+              <w:rPr>
+                <w:rFonts w:ascii="Times New Roman" w:hAnsi="Times New Roman"/>
+                <w:b w:val="0"/>
+                <w:sz w:val="20"/>
+              </w:rPr>
+              <w:t>7</w:t>
             </w:r>
           </w:p>
         </w:tc>
         <w:tc>
           <w:tcPr>
-            <w:tcW w:type="dxa" w:w="1587"/>
-            <w:tcMar>
-              <w:top w:w="80" w:type="dxa"/>
-              <w:bottom w:w="80" w:type="dxa"/>
-              <w:left w:w="100" w:type="dxa"/>
-              <w:right w:w="100" w:type="dxa"/>
-            </w:tcMar>
+            <w:tcW w:type="dxa" w:w="1984"/>
           </w:tcPr>
           <w:p>
             <w:pPr>
-              <w:spacing w:line="276" w:lineRule="auto" w:after="40"/>
-              <w:jc w:val="center"/>
+              <w:spacing w:after="0"/>
             </w:pPr>
+            <w:r/>
             <w:r>
               <w:rPr>
-                <w:b/>
-                <w:color w:val="10B981"/>
+                <w:rFonts w:ascii="Times New Roman" w:hAnsi="Times New Roman"/>
+                <w:b w:val="0"/>
+                <w:sz w:val="20"/>
+              </w:rPr>
+              <w:t>Locale tanggal</w:t>
+            </w:r>
+          </w:p>
+        </w:tc>
+        <w:tc>
+          <w:tcPr>
+            <w:tcW w:type="dxa" w:w="1984"/>
+          </w:tcPr>
+          <w:p>
+            <w:pPr>
+              <w:spacing w:after="0"/>
+            </w:pPr>
+            <w:r/>
+            <w:r>
+              <w:rPr>
+                <w:rFonts w:ascii="Times New Roman" w:hAnsi="Times New Roman"/>
+                <w:b w:val="0"/>
+                <w:sz w:val="20"/>
+              </w:rPr>
+              <w:t>Tanggal id_ID tampil tanpa LocaleDataException</w:t>
+            </w:r>
+          </w:p>
+        </w:tc>
+        <w:tc>
+          <w:tcPr>
+            <w:tcW w:type="dxa" w:w="1984"/>
+          </w:tcPr>
+          <w:p>
+            <w:pPr>
+              <w:spacing w:after="0"/>
+            </w:pPr>
+            <w:r/>
+            <w:r>
+              <w:rPr>
+                <w:rFonts w:ascii="Times New Roman" w:hAnsi="Times New Roman"/>
+                <w:b w:val="0"/>
+                <w:sz w:val="20"/>
+              </w:rPr>
+              <w:t>Berhasil</w:t>
+            </w:r>
+          </w:p>
+        </w:tc>
+      </w:tr>
+      <w:tr>
+        <w:tc>
+          <w:tcPr>
+            <w:tcW w:type="dxa" w:w="1984"/>
+          </w:tcPr>
+          <w:p>
+            <w:pPr>
+              <w:spacing w:after="0"/>
+            </w:pPr>
+            <w:r/>
+            <w:r>
+              <w:rPr>
+                <w:rFonts w:ascii="Times New Roman" w:hAnsi="Times New Roman"/>
+                <w:b w:val="0"/>
+                <w:sz w:val="20"/>
+              </w:rPr>
+              <w:t>8</w:t>
+            </w:r>
+          </w:p>
+        </w:tc>
+        <w:tc>
+          <w:tcPr>
+            <w:tcW w:type="dxa" w:w="1984"/>
+          </w:tcPr>
+          <w:p>
+            <w:pPr>
+              <w:spacing w:after="0"/>
+            </w:pPr>
+            <w:r/>
+            <w:r>
+              <w:rPr>
+                <w:rFonts w:ascii="Times New Roman" w:hAnsi="Times New Roman"/>
+                <w:b w:val="0"/>
+                <w:sz w:val="20"/>
+              </w:rPr>
+              <w:t>Automated test</w:t>
+            </w:r>
+          </w:p>
+        </w:tc>
+        <w:tc>
+          <w:tcPr>
+            <w:tcW w:type="dxa" w:w="1984"/>
+          </w:tcPr>
+          <w:p>
+            <w:pPr>
+              <w:spacing w:after="0"/>
+            </w:pPr>
+            <w:r/>
+            <w:r>
+              <w:rPr>
+                <w:rFonts w:ascii="Times New Roman" w:hAnsi="Times New Roman"/>
+                <w:b w:val="0"/>
+                <w:sz w:val="20"/>
+              </w:rPr>
+              <w:t>Semua test lulus</w:t>
+            </w:r>
+          </w:p>
+        </w:tc>
+        <w:tc>
+          <w:tcPr>
+            <w:tcW w:type="dxa" w:w="1984"/>
+          </w:tcPr>
+          <w:p>
+            <w:pPr>
+              <w:spacing w:after="0"/>
+            </w:pPr>
+            <w:r/>
+            <w:r>
+              <w:rPr>
+                <w:rFonts w:ascii="Times New Roman" w:hAnsi="Times New Roman"/>
+                <w:b w:val="0"/>
+                <w:sz w:val="20"/>
+              </w:rPr>
+              <w:t>10 test passed</w:t>
+            </w:r>
+          </w:p>
+        </w:tc>
+      </w:tr>
+      <w:tr>
+        <w:tc>
+          <w:tcPr>
+            <w:tcW w:type="dxa" w:w="1984"/>
+          </w:tcPr>
+          <w:p>
+            <w:pPr>
+              <w:spacing w:after="0"/>
+            </w:pPr>
+            <w:r/>
+            <w:r>
+              <w:rPr>
+                <w:rFonts w:ascii="Times New Roman" w:hAnsi="Times New Roman"/>
+                <w:b w:val="0"/>
+                <w:sz w:val="20"/>
+              </w:rPr>
+              <w:t>9</w:t>
+            </w:r>
+          </w:p>
+        </w:tc>
+        <w:tc>
+          <w:tcPr>
+            <w:tcW w:type="dxa" w:w="1984"/>
+          </w:tcPr>
+          <w:p>
+            <w:pPr>
+              <w:spacing w:after="0"/>
+            </w:pPr>
+            <w:r/>
+            <w:r>
+              <w:rPr>
+                <w:rFonts w:ascii="Times New Roman" w:hAnsi="Times New Roman"/>
+                <w:b w:val="0"/>
+                <w:sz w:val="20"/>
+              </w:rPr>
+              <w:t>APK Android</w:t>
+            </w:r>
+          </w:p>
+        </w:tc>
+        <w:tc>
+          <w:tcPr>
+            <w:tcW w:type="dxa" w:w="1984"/>
+          </w:tcPr>
+          <w:p>
+            <w:pPr>
+              <w:spacing w:after="0"/>
+            </w:pPr>
+            <w:r/>
+            <w:r>
+              <w:rPr>
+                <w:rFonts w:ascii="Times New Roman" w:hAnsi="Times New Roman"/>
+                <w:b w:val="0"/>
+                <w:sz w:val="20"/>
+              </w:rPr>
+              <w:t>Debug APK berhasil dibuat</w:t>
+            </w:r>
+          </w:p>
+        </w:tc>
+        <w:tc>
+          <w:tcPr>
+            <w:tcW w:type="dxa" w:w="1984"/>
+          </w:tcPr>
+          <w:p>
+            <w:pPr>
+              <w:spacing w:after="0"/>
+            </w:pPr>
+            <w:r/>
+            <w:r>
+              <w:rPr>
+                <w:rFonts w:ascii="Times New Roman" w:hAnsi="Times New Roman"/>
+                <w:b w:val="0"/>
+                <w:sz w:val="20"/>
               </w:rPr>
               <w:t>Berhasil</w:t>
             </w:r>
@@ -2511,215 +2300,192 @@
     </w:tbl>
     <w:p>
       <w:pPr>
-        <w:spacing w:after="120"/>
+        <w:pStyle w:val="Heading1"/>
+        <w:jc w:val="center"/>
       </w:pPr>
-    </w:p>
-    <w:p>
       <w:r>
-        <w:t>Hasil pengujian menunjukkan bahwa seluruh fungsionalitas inti, mekanisme penanganan asinkron, serta kedua teknik penyimpanan persistensi data lokal berjalan 100% sukses tanpa ditemukan bug atau kendala fatal.</w:t>
-      </w:r>
-    </w:p>
-    <w:p>
-      <w:r>
-        <w:br w:type="page"/>
+        <w:rPr>
+          <w:rFonts w:ascii="Times New Roman" w:hAnsi="Times New Roman"/>
+          <w:b w:val="0"/>
+          <w:sz w:val="24"/>
+        </w:rPr>
+        <w:t>BAB III</w:t>
       </w:r>
     </w:p>
     <w:p>
       <w:pPr>
-        <w:spacing w:after="240"/>
+        <w:pStyle w:val="Heading1"/>
         <w:jc w:val="center"/>
       </w:pPr>
       <w:r>
         <w:rPr>
-          <w:b/>
-          <w:sz w:val="28"/>
+          <w:rFonts w:ascii="Times New Roman" w:hAnsi="Times New Roman"/>
+          <w:b w:val="0"/>
+          <w:sz w:val="24"/>
         </w:rPr>
-        <w:t>BAB III</w:t>
-        <w:br/>
         <w:t>PENUTUP</w:t>
       </w:r>
     </w:p>
     <w:p>
       <w:pPr>
-        <w:spacing w:before="240" w:after="120"/>
+        <w:pStyle w:val="Heading2"/>
       </w:pPr>
       <w:r>
         <w:rPr>
-          <w:b/>
+          <w:rFonts w:ascii="Times New Roman" w:hAnsi="Times New Roman"/>
+          <w:b w:val="0"/>
           <w:sz w:val="24"/>
         </w:rPr>
-        <w:t>3.1. Kesimpulan</w:t>
-      </w:r>
-    </w:p>
-    <w:p>
-      <w:r>
-        <w:t>Berdasarkan proses perancangan, implementasi, dan pengujian aplikasi FinTrack yang telah diselesaikan, dapat ditarik beberapa kesimpulan utama sebagai berikut:</w:t>
+        <w:t>3.1 Kesimpulan</w:t>
       </w:r>
     </w:p>
     <w:p>
       <w:pPr>
-        <w:spacing w:after="80"/>
-        <w:ind w:left="425"/>
+        <w:ind w:firstLine="709"/>
       </w:pPr>
       <w:r>
-        <w:t>• Aplikasi FinTrack berhasil dibangun menggunakan framework Flutter dan bahasa pemrograman Dart dengan menerapkan arsitektur modular yang rapi dan terstruktur.</w:t>
+        <w:rPr>
+          <w:rFonts w:ascii="Times New Roman" w:hAnsi="Times New Roman"/>
+          <w:b w:val="0"/>
+          <w:sz w:val="24"/>
+        </w:rPr>
+        <w:t>FinTrack berhasil dibangun sebagai aplikasi pencatatan keuangan berbasis Flutter dengan struktur modular. Aplikasi menerapkan asynchronous programming, SQLite, SharedPreferences, pencarian, filter, statistik, tema, dan validasi form. Revisi locale id_ID menghilangkan error saat pencatatan transaksi, sedangkan konfigurasi Kotlin mencegah konflik incremental cache pada build Android. Verifikasi terbaru menunjukkan flutter analyze bersih, seluruh 10 test lulus, dan debug APK berhasil dibangun.</w:t>
       </w:r>
     </w:p>
     <w:p>
       <w:pPr>
-        <w:spacing w:after="80"/>
-        <w:ind w:left="425"/>
+        <w:pStyle w:val="Heading2"/>
       </w:pPr>
       <w:r>
-        <w:t>• Konsep Asynchronous Programming (Future, async, await, Future.wait, dan Future.delayed) berhasil diimplementasikan secara optimal pada seluruh operasi I/O database, penyimpanan preferensi, dan pemanggilan data eksternal sehingga antarmuka pengguna tetap responsif dan bebas dari gejala pembekuan (freezing).</w:t>
+        <w:rPr>
+          <w:rFonts w:ascii="Times New Roman" w:hAnsi="Times New Roman"/>
+          <w:b w:val="0"/>
+          <w:sz w:val="24"/>
+        </w:rPr>
+        <w:t>3.2 Saran</w:t>
       </w:r>
     </w:p>
     <w:p>
       <w:pPr>
-        <w:spacing w:after="80"/>
-        <w:ind w:left="425"/>
+        <w:pStyle w:val="ListBullet"/>
+        <w:spacing w:line="360" w:lineRule="auto"/>
+        <w:jc w:val="both"/>
       </w:pPr>
       <w:r>
-        <w:t>• Dua teknik data persistence berhasil diintegrasikan secara tepat guna sesuai kebutuhan aplikasi: SharedPreferences menangani data preferensi ringan key-value (mode tema, nama pengguna, target budget), sedangkan SQLite menangani data transaksional relasional terstruktur (CRUD transaksi dan perhitungan agregat saldo).</w:t>
+        <w:t>Menambahkan sinkronisasi cloud untuk akses lintas perangkat.</w:t>
       </w:r>
     </w:p>
     <w:p>
       <w:pPr>
-        <w:spacing w:after="80"/>
-        <w:ind w:left="425"/>
+        <w:pStyle w:val="ListBullet"/>
+        <w:spacing w:line="360" w:lineRule="auto"/>
+        <w:jc w:val="both"/>
       </w:pPr>
       <w:r>
-        <w:t>• Pengujian persistensi membuktikan bahwa aplikasi mampu beroperasi secara offline-first dengan integritas data yang terjaga sempurna setelah aplikasi ditutup paksa maupun dimulai ulang.</w:t>
+        <w:t>Menambahkan ekspor laporan ke PDF atau Excel.</w:t>
       </w:r>
     </w:p>
     <w:p>
       <w:pPr>
-        <w:spacing w:before="240" w:after="120"/>
+        <w:pStyle w:val="ListBullet"/>
+        <w:spacing w:line="360" w:lineRule="auto"/>
+        <w:jc w:val="both"/>
       </w:pPr>
       <w:r>
-        <w:rPr>
-          <w:b/>
-          <w:sz w:val="24"/>
-        </w:rPr>
-        <w:t>3.2. Saran</w:t>
-      </w:r>
-    </w:p>
-    <w:p>
-      <w:r>
-        <w:t>Untuk pengembangan aplikasi FinTrack pada tahap selanjutnya, beberapa saran perbaikan yang dapat diterapkan antara lain:</w:t>
+        <w:t>Menambahkan grafik interaktif menggunakan fl_chart.</w:t>
       </w:r>
     </w:p>
     <w:p>
       <w:pPr>
-        <w:spacing w:after="80"/>
-        <w:ind w:left="425"/>
+        <w:pStyle w:val="ListBullet"/>
+        <w:spacing w:line="360" w:lineRule="auto"/>
+        <w:jc w:val="both"/>
       </w:pPr>
       <w:r>
-        <w:t>• Menambahkan integrasi sinkronisasi data berbasis Cloud (seperti Firebase Cloud Firestore atau Supabase) agar riwayat transaksi dapat diakses dari beberapa perangkat secara bersamaan (multi-device sync).</w:t>
+        <w:t>Menambahkan autentikasi biometrik untuk perlindungan data.</w:t>
       </w:r>
     </w:p>
     <w:p>
       <w:pPr>
-        <w:spacing w:after="80"/>
-        <w:ind w:left="425"/>
-      </w:pPr>
-      <w:r>
-        <w:t>• Mengimplementasikan fitur ekspor dan impor laporan keuangan ke format berkas Excel (.xlsx) atau dokumen PDF menggunakan path_provider dan package cetak lokal.</w:t>
-      </w:r>
-    </w:p>
-    <w:p>
-      <w:pPr>
-        <w:spacing w:after="80"/>
-        <w:ind w:left="425"/>
-      </w:pPr>
-      <w:r>
-        <w:t>• Menambahkan visualisasi grafik diagram lingkaran (Pie Chart) atau diagram batang interaktif menggunakan pustaka fl_chart untuk analisis keuangan yang lebih mendalam.</w:t>
-      </w:r>
-    </w:p>
-    <w:p>
-      <w:pPr>
-        <w:spacing w:after="80"/>
-        <w:ind w:left="425"/>
-      </w:pPr>
-      <w:r>
-        <w:t>• Menerapkan sistem keamanan biometrik (Fingerprint / Face ID) menggunakan local_auth untuk melindungi privasi catatan keuangan pengguna.</w:t>
-      </w:r>
-    </w:p>
-    <w:p>
-      <w:r>
-        <w:br w:type="page"/>
-      </w:r>
-    </w:p>
-    <w:p>
-      <w:pPr>
-        <w:spacing w:after="360"/>
-        <w:jc w:val="center"/>
+        <w:pStyle w:val="Heading1"/>
       </w:pPr>
       <w:r>
         <w:rPr>
-          <w:b/>
-          <w:sz w:val="28"/>
+          <w:rFonts w:ascii="Times New Roman" w:hAnsi="Times New Roman"/>
+          <w:b w:val="0"/>
+          <w:sz w:val="24"/>
         </w:rPr>
         <w:t>DAFTAR PUSTAKA</w:t>
       </w:r>
     </w:p>
     <w:p>
       <w:pPr>
-        <w:spacing w:after="160" w:line="276" w:lineRule="auto"/>
-        <w:ind w:left="720" w:hanging="720"/>
+        <w:ind w:firstLine="709"/>
       </w:pPr>
       <w:r>
-        <w:t>Flutter Documentation. (2026). Asynchronous Programming: Futures and Async-Await in Dart. Google Developers. Diakses dari https://docs.flutter.dev/codelabs/async-await</w:t>
+        <w:rPr>
+          <w:rFonts w:ascii="Times New Roman" w:hAnsi="Times New Roman"/>
+          <w:b w:val="0"/>
+          <w:sz w:val="24"/>
+        </w:rPr>
+        <w:t>Flutter Documentation. Asynchronous programming: Futures and async-await in Dart. https://docs.flutter.dev/codelabs/async-await</w:t>
       </w:r>
     </w:p>
     <w:p>
       <w:pPr>
-        <w:spacing w:after="160" w:line="276" w:lineRule="auto"/>
-        <w:ind w:left="720" w:hanging="720"/>
+        <w:ind w:firstLine="709"/>
       </w:pPr>
       <w:r>
-        <w:t>Flutter Documentation. (2026). Persist data with SQLite. Google Developers. Diakses dari https://docs.flutter.dev/cookbook/persistence/sqlite</w:t>
+        <w:rPr>
+          <w:rFonts w:ascii="Times New Roman" w:hAnsi="Times New Roman"/>
+          <w:b w:val="0"/>
+          <w:sz w:val="24"/>
+        </w:rPr>
+        <w:t>Flutter Documentation. Persist data with SQLite. https://docs.flutter.dev/cookbook/persistence/sqlite</w:t>
       </w:r>
     </w:p>
     <w:p>
       <w:pPr>
-        <w:spacing w:after="160" w:line="276" w:lineRule="auto"/>
-        <w:ind w:left="720" w:hanging="720"/>
+        <w:ind w:firstLine="709"/>
       </w:pPr>
       <w:r>
-        <w:t>Flutter Documentation. (2026). Store key-value data on disk with shared_preferences. Google Developers. Diakses dari https://docs.flutter.dev/cookbook/persistence/key-value</w:t>
+        <w:rPr>
+          <w:rFonts w:ascii="Times New Roman" w:hAnsi="Times New Roman"/>
+          <w:b w:val="0"/>
+          <w:sz w:val="24"/>
+        </w:rPr>
+        <w:t>Flutter Documentation. Store key-value data on disk with shared_preferences. https://docs.flutter.dev/cookbook/persistence/key-value</w:t>
       </w:r>
     </w:p>
     <w:p>
       <w:pPr>
-        <w:spacing w:after="160" w:line="276" w:lineRule="auto"/>
-        <w:ind w:left="720" w:hanging="720"/>
+        <w:ind w:firstLine="709"/>
       </w:pPr>
       <w:r>
-        <w:t>Material Design. (2026). Material 3 Design Guidelines. Google. Diakses dari https://m3.material.io/</w:t>
+        <w:rPr>
+          <w:rFonts w:ascii="Times New Roman" w:hAnsi="Times New Roman"/>
+          <w:b w:val="0"/>
+          <w:sz w:val="24"/>
+        </w:rPr>
+        <w:t>Material Design 3 Guidelines. https://m3.material.io/</w:t>
       </w:r>
     </w:p>
     <w:p>
       <w:pPr>
-        <w:spacing w:after="160" w:line="276" w:lineRule="auto"/>
-        <w:ind w:left="720" w:hanging="720"/>
+        <w:ind w:firstLine="709"/>
       </w:pPr>
       <w:r>
-        <w:t>Tekse, A. (2025). sqflite: SQLite plugin for Flutter. Pub.dev Repository. Diakses dari https://pub.dev/packages/sqflite</w:t>
-      </w:r>
-    </w:p>
-    <w:p>
-      <w:pPr>
-        <w:spacing w:after="160" w:line="276" w:lineRule="auto"/>
-        <w:ind w:left="720" w:hanging="720"/>
-      </w:pPr>
-      <w:r>
-        <w:t>The Dart Project. (2026). intl: Internationalization and localization support for Dart. Pub.dev Repository. Diakses dari https://pub.dev/packages/intl</w:t>
+        <w:rPr>
+          <w:rFonts w:ascii="Times New Roman" w:hAnsi="Times New Roman"/>
+          <w:b w:val="0"/>
+          <w:sz w:val="24"/>
+        </w:rPr>
+        <w:t>Dart Packages: intl, sqflite, shared_preferences. https://pub.dev/</w:t>
       </w:r>
     </w:p>
     <w:sectPr>
       <w:pgSz w:w="11906" w:h="16838"/>
-      <w:pgMar w:top="1701" w:right="1701" w:bottom="1701" w:left="2268" w:header="720" w:footer="720" w:gutter="0"/>
+      <w:pgMar w:top="2268" w:right="1701" w:bottom="1701" w:left="2268" w:header="720" w:footer="720" w:gutter="0"/>
       <w:cols w:space="720"/>
       <w:docGrid w:linePitch="360"/>
     </w:sectPr>
@@ -3091,12 +2857,12 @@
     <w:qFormat/>
     <w:rsid w:val="00FC693F"/>
     <w:pPr>
-      <w:spacing w:line="360" w:lineRule="auto" w:after="120"/>
+      <w:spacing w:line="360" w:lineRule="auto"/>
+      <w:ind w:firstLine="709"/>
       <w:jc w:val="both"/>
     </w:pPr>
     <w:rPr>
-      <w:rFonts w:ascii="Times New Roman" w:hAnsi="Times New Roman"/>
-      <w:color w:val="000000"/>
+      <w:rFonts w:ascii="Times New Roman" w:hAnsi="Times New Roman" w:eastAsia="Times New Roman"/>
       <w:sz w:val="24"/>
     </w:rPr>
   </w:style>
@@ -3155,15 +2921,16 @@
     <w:pPr>
       <w:keepNext/>
       <w:keepLines/>
-      <w:spacing w:before="480" w:after="0"/>
+      <w:spacing w:before="200" w:after="80"/>
+      <w:ind w:firstLine="0"/>
       <w:outlineLvl w:val="0"/>
     </w:pPr>
     <w:rPr>
-      <w:rFonts w:asciiTheme="majorHAnsi" w:eastAsiaTheme="majorEastAsia" w:hAnsiTheme="majorHAnsi" w:cstheme="majorBidi"/>
+      <w:rFonts w:asciiTheme="majorHAnsi" w:eastAsiaTheme="majorEastAsia" w:hAnsiTheme="majorHAnsi" w:cstheme="majorBidi" w:ascii="Times New Roman" w:hAnsi="Times New Roman" w:eastAsia="Times New Roman"/>
       <w:b/>
       <w:bCs/>
       <w:color w:val="365F91" w:themeColor="accent1" w:themeShade="BF"/>
-      <w:sz w:val="28"/>
+      <w:sz w:val="24"/>
       <w:szCs w:val="28"/>
     </w:rPr>
   </w:style>
@@ -3179,15 +2946,16 @@
     <w:pPr>
       <w:keepNext/>
       <w:keepLines/>
-      <w:spacing w:before="200" w:after="0"/>
+      <w:spacing w:before="200" w:after="80"/>
+      <w:ind w:firstLine="0"/>
       <w:outlineLvl w:val="1"/>
     </w:pPr>
     <w:rPr>
-      <w:rFonts w:asciiTheme="majorHAnsi" w:eastAsiaTheme="majorEastAsia" w:hAnsiTheme="majorHAnsi" w:cstheme="majorBidi"/>
+      <w:rFonts w:asciiTheme="majorHAnsi" w:eastAsiaTheme="majorEastAsia" w:hAnsiTheme="majorHAnsi" w:cstheme="majorBidi" w:ascii="Times New Roman" w:hAnsi="Times New Roman" w:eastAsia="Times New Roman"/>
       <w:b/>
       <w:bCs/>
       <w:color w:val="4F81BD" w:themeColor="accent1"/>
-      <w:sz w:val="26"/>
+      <w:sz w:val="24"/>
       <w:szCs w:val="26"/>
     </w:rPr>
   </w:style>
@@ -3203,14 +2971,16 @@
     <w:pPr>
       <w:keepNext/>
       <w:keepLines/>
-      <w:spacing w:before="200" w:after="0"/>
+      <w:spacing w:before="200" w:after="80"/>
+      <w:ind w:firstLine="0"/>
       <w:outlineLvl w:val="2"/>
     </w:pPr>
     <w:rPr>
-      <w:rFonts w:asciiTheme="majorHAnsi" w:eastAsiaTheme="majorEastAsia" w:hAnsiTheme="majorHAnsi" w:cstheme="majorBidi"/>
+      <w:rFonts w:asciiTheme="majorHAnsi" w:eastAsiaTheme="majorEastAsia" w:hAnsiTheme="majorHAnsi" w:cstheme="majorBidi" w:ascii="Times New Roman" w:hAnsi="Times New Roman" w:eastAsia="Times New Roman"/>
       <w:b/>
       <w:bCs/>
       <w:color w:val="4F81BD" w:themeColor="accent1"/>
+      <w:sz w:val="24"/>
     </w:rPr>
   </w:style>
   <w:style w:type="paragraph" w:styleId="Heading4">

</xml_diff>